<commit_message>
fix(flotte): aligne les modes de livraison et régénère les docx
Remplace les dernières promesses horodatées dans la tarification, les devis et le checkout :

- packages/shared/constants/delivery-pricing.ts : Express devient « prioritaire à Abidjan » ;

- devis.service.ts et choose/[shareToken]/page.tsx : labels et footers alignés ;

- régénération des .docx à partir des Markdown mis à jour (13 documents).

Les PDF ne sont pas régénérés car aucun moteur PDF n’est disponible sur ce poste.
</commit_message>
<xml_diff>
--- a/docs/CRO_BIBLE.docx
+++ b/docs/CRO_BIBLE.docx
@@ -2,7 +2,7 @@
 <file path=word/document.xml><?xml version="1.0" encoding="utf-8"?>
 <w:document xmlns:w="http://schemas.openxmlformats.org/wordprocessingml/2006/main" xmlns:m="http://schemas.openxmlformats.org/officeDocument/2006/math" xmlns:r="http://schemas.openxmlformats.org/officeDocument/2006/relationships" xmlns:o="urn:schemas-microsoft-com:office:office" xmlns:v="urn:schemas-microsoft-com:vml" xmlns:w10="urn:schemas-microsoft-com:office:word" xmlns:a="http://schemas.openxmlformats.org/drawingml/2006/main" xmlns:pic="http://schemas.openxmlformats.org/drawingml/2006/picture" xmlns:wp="http://schemas.openxmlformats.org/drawingml/2006/wordprocessingDrawing">
   <w:body>
-    <w:bookmarkStart w:id="59" w:name="cro-bible--pièces"/>
+    <w:bookmarkStart w:id="70" w:name="cro-bible-pièces"/>
     <w:p>
       <w:pPr>
         <w:pStyle w:val="Heading1"/>
@@ -58,17 +58,17 @@
         <w:t xml:space="preserve"> </w:t>
       </w:r>
       <w:r>
-        <w:t xml:space="preserve">: 0 → machine à revenus prévisible, croissante et défendable en une journée de lecture. Tout ce qu'il faut pour transformer le marché décrit par le CEO en</w:t>
-      </w:r>
-      <w:r>
-        <w:t xml:space="preserve"> </w:t>
-      </w:r>
-      <w:r>
-        <w:rPr>
-          <w:b/>
-          <w:bCs/>
-        </w:rPr>
-        <w:t xml:space="preserve">chiffre d'affaires encaissé</w:t>
+        <w:t xml:space="preserve">: 0 → machine à revenus prévisible, croissante et défendable en une journée de lecture. Tout ce qu’il faut pour transformer le marché décrit par le CEO en</w:t>
+      </w:r>
+      <w:r>
+        <w:t xml:space="preserve"> </w:t>
+      </w:r>
+      <w:r>
+        <w:rPr>
+          <w:b/>
+          <w:bCs/>
+        </w:rPr>
+        <w:t xml:space="preserve">chiffre d’affaires encaissé</w:t>
       </w:r>
       <w:r>
         <w:t xml:space="preserve">, optimiser chaque levier de monétisation, et faire de Pièces une entreprise dont le revenu se prévoit au franc près.</w:t>
@@ -94,7 +94,7 @@
       <w:r>
         <w:t xml:space="preserve"> </w:t>
       </w:r>
-      <w:hyperlink r:id="rId9">
+      <w:hyperlink r:id="rId20">
         <w:r>
           <w:rPr>
             <w:rStyle w:val="VerbatimChar"/>
@@ -111,7 +111,7 @@
       <w:r>
         <w:t xml:space="preserve"> </w:t>
       </w:r>
-      <w:hyperlink r:id="rId10">
+      <w:hyperlink r:id="rId21">
         <w:r>
           <w:rPr>
             <w:rStyle w:val="VerbatimChar"/>
@@ -128,7 +128,7 @@
       <w:r>
         <w:t xml:space="preserve"> </w:t>
       </w:r>
-      <w:hyperlink r:id="rId11">
+      <w:hyperlink r:id="rId22">
         <w:r>
           <w:rPr>
             <w:rStyle w:val="VerbatimChar"/>
@@ -140,17 +140,17 @@
         <w:t xml:space="preserve"> </w:t>
       </w:r>
       <w:r>
-        <w:t xml:space="preserve">(les règles produit non négociables), puis ce document. Le CRO vit à l'intersection des trois :</w:t>
-      </w:r>
-      <w:r>
-        <w:t xml:space="preserve"> </w:t>
-      </w:r>
-      <w:r>
-        <w:rPr>
-          <w:b/>
-          <w:bCs/>
-        </w:rPr>
-        <w:t xml:space="preserve">le CEO fixe le cap, le CTO construit l'instrument, le CRO encaisse</w:t>
+        <w:t xml:space="preserve">(les règles produit non négociables), puis ce document. Le CRO vit à l’intersection des trois :</w:t>
+      </w:r>
+      <w:r>
+        <w:t xml:space="preserve"> </w:t>
+      </w:r>
+      <w:r>
+        <w:rPr>
+          <w:b/>
+          <w:bCs/>
+        </w:rPr>
+        <w:t xml:space="preserve">le CEO fixe le cap, le CTO construit l’instrument, le CRO encaisse</w:t>
       </w:r>
       <w:r>
         <w:t xml:space="preserve">.</w:t>
@@ -165,7 +165,7 @@
           <w:b/>
           <w:bCs/>
         </w:rPr>
-        <w:t xml:space="preserve">Règle d'or du poste</w:t>
+        <w:t xml:space="preserve">Règle d’or du poste</w:t>
       </w:r>
       <w:r>
         <w:t xml:space="preserve"> </w:t>
@@ -187,7 +187,7 @@
         <w:t xml:space="preserve"> </w:t>
       </w:r>
       <w:r>
-        <w:t xml:space="preserve">— le revenu net récurrent et transactionnel — et tout ce qui le fait monter ou descendre. Si ça touche au revenu, c'est ton problème, même si l'équipe est ailleurs.</w:t>
+        <w:t xml:space="preserve">— le revenu net récurrent et transactionnel — et tout ce qui le fait monter ou descendre. Si ça touche au revenu, c’est ton problème, même si l’équipe est ailleurs.</w:t>
       </w:r>
     </w:p>
     <w:p>
@@ -197,7 +197,7 @@
         </w:pict>
       </w:r>
     </w:p>
-    <w:bookmarkStart w:id="12" w:name="X4d0dbeb8bfc6a379c074b88227029d6a2d3954f"/>
+    <w:bookmarkStart w:id="23" w:name="le-mandat-en-90-secondes"/>
     <w:p>
       <w:pPr>
         <w:pStyle w:val="Heading2"/>
@@ -233,7 +233,7 @@
         <w:t xml:space="preserve"> </w:t>
       </w:r>
       <w:r>
-        <w:t xml:space="preserve">(commission marketplace) — volatil, à fort volume, dépend du flux mécanicien→propriétaire→vendeur. C'est le</w:t>
+        <w:t xml:space="preserve">(commission marketplace) — volatil, à fort volume, dépend du flux mécanicien→propriétaire→vendeur. C’est le</w:t>
       </w:r>
       <w:r>
         <w:t xml:space="preserve"> </w:t>
@@ -268,7 +268,7 @@
         <w:t xml:space="preserve"> </w:t>
       </w:r>
       <w:r>
-        <w:t xml:space="preserve">(abonnements Flotte Pro / Pro +) — prévisible, à forte marge, defendable. C'est le</w:t>
+        <w:t xml:space="preserve">(abonnements Flotte Pro / Pro +) — prévisible, à forte marge, defendable. C’est le</w:t>
       </w:r>
       <w:r>
         <w:t xml:space="preserve"> </w:t>
@@ -303,7 +303,7 @@
         <w:t xml:space="preserve"> </w:t>
       </w:r>
       <w:r>
-        <w:t xml:space="preserve">(facturation FNE-CI, prestations, data) — petit aujourd'hui, levier d'acquisition et de rétention demain, centre de profit à terme.</w:t>
+        <w:t xml:space="preserve">(facturation FNE-CI, prestations, data) — petit aujourd’hui, levier d’acquisition et de rétention demain, centre de profit à terme.</w:t>
       </w:r>
     </w:p>
     <w:p>
@@ -394,7 +394,7 @@
         <w:t xml:space="preserve">≥ 50% récurrent</w:t>
       </w:r>
       <w:r>
-        <w:t xml:space="preserve">, NRR &gt; 115%, forecast trimestriel tenu à ±10%, et un coût d'acquisition amorti en &lt; 9 mois sur tous les segments.</w:t>
+        <w:t xml:space="preserve">, NRR &gt; 115%, forecast trimestriel tenu à ±10%, et un coût d’acquisition amorti en &lt; 9 mois sur tous les segments.</w:t>
       </w:r>
     </w:p>
     <w:p>
@@ -414,41 +414,23 @@
       <w:r>
         <w:t xml:space="preserve">:</w:t>
       </w:r>
-    </w:p>
-    <w:p>
-      <w:pPr>
-        <w:pStyle w:val="Compact"/>
-        <w:numPr>
-          <w:ilvl w:val="0"/>
-          <w:numId w:val="1002"/>
-        </w:numPr>
-      </w:pPr>
-      <w:r>
-        <w:t xml:space="preserve">Acheter du GMV non rentable pour gonfler un chiffre de vanité.</w:t>
-      </w:r>
-    </w:p>
-    <w:p>
-      <w:pPr>
-        <w:pStyle w:val="Compact"/>
-        <w:numPr>
-          <w:ilvl w:val="0"/>
-          <w:numId w:val="1002"/>
-        </w:numPr>
-      </w:pPr>
-      <w:r>
-        <w:t xml:space="preserve">Vendre du Flotte Pro + sans que l'ops puisse tenir le SLA 4h (churn explosif).</w:t>
-      </w:r>
-    </w:p>
-    <w:p>
-      <w:pPr>
-        <w:pStyle w:val="Compact"/>
-        <w:numPr>
-          <w:ilvl w:val="0"/>
-          <w:numId w:val="1002"/>
-        </w:numPr>
-      </w:pPr>
-      <w:r>
-        <w:t xml:space="preserve">Brader la facture FNE-CI ou les abonnements en early-stage et ne jamais réussir à remonter les prix.</w:t>
+      <w:r>
+        <w:t xml:space="preserve"> </w:t>
+      </w:r>
+      <w:r>
+        <w:t xml:space="preserve">- Acheter du GMV non rentable pour gonfler un chiffre de vanité.</w:t>
+      </w:r>
+      <w:r>
+        <w:t xml:space="preserve"> </w:t>
+      </w:r>
+      <w:r>
+        <w:t xml:space="preserve">- Vendre du Flotte Pro + sans que l’ops puisse tenir la livraison prioritaire (churn explosif).</w:t>
+      </w:r>
+      <w:r>
+        <w:t xml:space="preserve"> </w:t>
+      </w:r>
+      <w:r>
+        <w:t xml:space="preserve">- Brader la facture FNE-CI ou les abonnements en early-stage et ne jamais réussir à remonter les prix.</w:t>
       </w:r>
     </w:p>
     <w:p>
@@ -458,29 +440,30 @@
         </w:pict>
       </w:r>
     </w:p>
-    <w:bookmarkEnd w:id="12"/>
-    <w:bookmarkStart w:id="16" w:name="X5cc4195622644c8fc2574924c63dd483887ece9"/>
+    <w:bookmarkEnd w:id="23"/>
+    <w:bookmarkStart w:id="27" w:name="Xe752ed353b6c5cf86a711e5c3ded62b6d40a9d8"/>
     <w:p>
       <w:pPr>
         <w:pStyle w:val="Heading2"/>
       </w:pPr>
       <w:r>
-        <w:t xml:space="preserve">2. L'architecture de revenu — où l'argent entre, précisément</w:t>
-      </w:r>
-    </w:p>
-    <w:bookmarkStart w:id="13" w:name="Xc5ef98b6371c5ddd2755482d7bc521f093a7096"/>
+        <w:t xml:space="preserve">2. L’architecture de revenu — où l’argent entre, précisément</w:t>
+      </w:r>
+    </w:p>
+    <w:bookmarkStart w:id="24" w:name="X371f7e8db73b9d7d32eccd0c8b11e4612f0de79"/>
     <w:p>
       <w:pPr>
         <w:pStyle w:val="Heading3"/>
       </w:pPr>
       <w:r>
-        <w:t xml:space="preserve">2.1 Les quatre flux et leur mécanique d'encaissement</w:t>
+        <w:t xml:space="preserve">2.1 Les quatre flux et leur mécanique d’encaissement</w:t>
       </w:r>
     </w:p>
     <w:tbl>
       <w:tblPr>
         <w:tblStyle w:val="Table"/>
-        <w:tblW w:type="auto" w:w="0"/>
+        <w:tblW w:type="pct" w:w="5000"/>
+        <w:tblLayout w:type="fixed"/>
         <w:tblLook w:firstRow="1" w:lastRow="0" w:firstColumn="0" w:lastColumn="0" w:noHBand="0" w:noVBand="0" w:val="0020"/>
       </w:tblPr>
       <w:tblGrid>
@@ -512,7 +495,7 @@
               <w:pStyle w:val="Compact"/>
             </w:pPr>
             <w:r>
-              <w:t xml:space="preserve">Déclencheur d'encaissement</w:t>
+              <w:t xml:space="preserve">Déclencheur d’encaissement</w:t>
             </w:r>
           </w:p>
         </w:tc>
@@ -573,7 +556,7 @@
               <w:pStyle w:val="Compact"/>
             </w:pPr>
             <w:r>
-              <w:t xml:space="preserve">Release de l'escrow à la livraison confirmée</w:t>
+              <w:t xml:space="preserve">Release de l’escrow à la livraison confirmée</w:t>
             </w:r>
           </w:p>
         </w:tc>
@@ -704,7 +687,7 @@
               <w:pStyle w:val="Compact"/>
             </w:pPr>
             <w:r>
-              <w:t xml:space="preserve">Idem + premium SLA</w:t>
+              <w:t xml:space="preserve">Prélèvement Mobile Money / virement mensuel</w:t>
             </w:r>
           </w:p>
         </w:tc>
@@ -765,7 +748,7 @@
               <w:pStyle w:val="Compact"/>
             </w:pPr>
             <w:r>
-              <w:t xml:space="preserve">Forfait ou à l'usage</w:t>
+              <w:t xml:space="preserve">Forfait ou à l’usage</w:t>
             </w:r>
           </w:p>
         </w:tc>
@@ -819,7 +802,7 @@
         <w:t xml:space="preserve"> </w:t>
       </w:r>
       <w:r>
-        <w:t xml:space="preserve">: le revenu marketplace n'est</w:t>
+        <w:t xml:space="preserve">: le revenu marketplace n’est</w:t>
       </w:r>
       <w:r>
         <w:t xml:space="preserve"> </w:t>
@@ -835,7 +818,7 @@
         <w:t xml:space="preserve"> </w:t>
       </w:r>
       <w:r>
-        <w:t xml:space="preserve">qu'au release escrow (état</w:t>
+        <w:t xml:space="preserve">qu’au release escrow (état</w:t>
       </w:r>
       <w:r>
         <w:t xml:space="preserve"> </w:t>
@@ -877,7 +860,7 @@
         <w:t xml:space="preserve"> </w:t>
       </w:r>
       <w:r>
-        <w:t xml:space="preserve">mais non livrée n'est</w:t>
+        <w:t xml:space="preserve">mais non livrée n’est</w:t>
       </w:r>
       <w:r>
         <w:t xml:space="preserve"> </w:t>
@@ -893,11 +876,11 @@
         <w:t xml:space="preserve"> </w:t>
       </w:r>
       <w:r>
-        <w:t xml:space="preserve">du revenu : c'est du GMV en transit. Ne jamais forecaster sur du GMV non livré.</w:t>
-      </w:r>
-    </w:p>
-    <w:bookmarkEnd w:id="13"/>
-    <w:bookmarkStart w:id="14" w:name="X95ee53ebb36ac5f3468e28039d86e97f4afe5b6"/>
+        <w:t xml:space="preserve">du revenu : c’est du GMV en transit. Ne jamais forecaster sur du GMV non livré.</w:t>
+      </w:r>
+    </w:p>
+    <w:bookmarkEnd w:id="24"/>
+    <w:bookmarkStart w:id="25" w:name="la-formule-maîtresse-du-revenu"/>
     <w:p>
       <w:pPr>
         <w:pStyle w:val="Heading3"/>
@@ -949,7 +932,128 @@
         <w:pStyle w:val="FirstParagraph"/>
       </w:pPr>
       <w:r>
-        <w:t xml:space="preserve">Décompose chaque terme jusqu'au levier actionnable :</w:t>
+        <w:t xml:space="preserve">Décompose chaque terme jusqu’au levier actionnable :</w:t>
+      </w:r>
+    </w:p>
+    <w:p>
+      <w:pPr>
+        <w:pStyle w:val="Compact"/>
+        <w:numPr>
+          <w:ilvl w:val="0"/>
+          <w:numId w:val="1002"/>
+        </w:numPr>
+      </w:pPr>
+      <w:r>
+        <w:rPr>
+          <w:b/>
+          <w:bCs/>
+        </w:rPr>
+        <w:t xml:space="preserve">GMV livré</w:t>
+      </w:r>
+      <w:r>
+        <w:t xml:space="preserve"> </w:t>
+      </w:r>
+      <w:r>
+        <w:t xml:space="preserve">= commandes livrées/jour × panier moyen × jours.</w:t>
+      </w:r>
+    </w:p>
+    <w:p>
+      <w:pPr>
+        <w:pStyle w:val="Compact"/>
+        <w:numPr>
+          <w:ilvl w:val="0"/>
+          <w:numId w:val="1002"/>
+        </w:numPr>
+      </w:pPr>
+      <w:r>
+        <w:rPr>
+          <w:b/>
+          <w:bCs/>
+        </w:rPr>
+        <w:t xml:space="preserve">Take rate effective</w:t>
+      </w:r>
+      <w:r>
+        <w:t xml:space="preserve"> </w:t>
+      </w:r>
+      <w:r>
+        <w:t xml:space="preserve">= commission affichée − (remises + impayés + fraude + rétro-commissions Liaison).</w:t>
+      </w:r>
+    </w:p>
+    <w:p>
+      <w:pPr>
+        <w:pStyle w:val="Compact"/>
+        <w:numPr>
+          <w:ilvl w:val="0"/>
+          <w:numId w:val="1002"/>
+        </w:numPr>
+      </w:pPr>
+      <w:r>
+        <w:rPr>
+          <w:b/>
+          <w:bCs/>
+        </w:rPr>
+        <w:t xml:space="preserve">Véhicules actifs</w:t>
+      </w:r>
+      <w:r>
+        <w:t xml:space="preserve"> </w:t>
+      </w:r>
+      <w:r>
+        <w:t xml:space="preserve">= véhicules signés × (1 − churn) + expansion (upsell Pro → Pro +).</w:t>
+      </w:r>
+    </w:p>
+    <w:p>
+      <w:pPr>
+        <w:pStyle w:val="Compact"/>
+        <w:numPr>
+          <w:ilvl w:val="0"/>
+          <w:numId w:val="1002"/>
+        </w:numPr>
+      </w:pPr>
+      <w:r>
+        <w:rPr>
+          <w:b/>
+          <w:bCs/>
+        </w:rPr>
+        <w:t xml:space="preserve">ARPU abonnement</w:t>
+      </w:r>
+      <w:r>
+        <w:t xml:space="preserve"> </w:t>
+      </w:r>
+      <w:r>
+        <w:t xml:space="preserve">= mix Pro (5 000 F) / Pro + (10 000 F) × taux de recouvrement réel.</w:t>
+      </w:r>
+    </w:p>
+    <w:p>
+      <w:pPr>
+        <w:pStyle w:val="FirstParagraph"/>
+      </w:pPr>
+      <w:r>
+        <w:rPr>
+          <w:b/>
+          <w:bCs/>
+        </w:rPr>
+        <w:t xml:space="preserve">Chaque levier de ce développement est un projet CRO</w:t>
+      </w:r>
+      <w:r>
+        <w:t xml:space="preserve">. Si tu ne sais pas lequel bouger ce trimestre, tu n’as pas de plan.</w:t>
+      </w:r>
+    </w:p>
+    <w:bookmarkEnd w:id="25"/>
+    <w:bookmarkStart w:id="26" w:name="Xf816cdd507300f6ddeb74c763430f7bfd721136"/>
+    <w:p>
+      <w:pPr>
+        <w:pStyle w:val="Heading3"/>
+      </w:pPr>
+      <w:r>
+        <w:t xml:space="preserve">2.3 Les fuites de revenu (revenue leakage) — la chasse permanente</w:t>
+      </w:r>
+    </w:p>
+    <w:p>
+      <w:pPr>
+        <w:pStyle w:val="FirstParagraph"/>
+      </w:pPr>
+      <w:r>
+        <w:t xml:space="preserve">Le revenu ne se perd pas qu’en haut du funnel. Audit mensuel obligatoire sur :</w:t>
       </w:r>
     </w:p>
     <w:p>
@@ -965,13 +1069,13 @@
           <w:b/>
           <w:bCs/>
         </w:rPr>
-        <w:t xml:space="preserve">GMV livré</w:t>
-      </w:r>
-      <w:r>
-        <w:t xml:space="preserve"> </w:t>
-      </w:r>
-      <w:r>
-        <w:t xml:space="preserve">= commandes livrées/jour × panier moyen × jours.</w:t>
+        <w:t xml:space="preserve">Take rate erodée</w:t>
+      </w:r>
+      <w:r>
+        <w:t xml:space="preserve"> </w:t>
+      </w:r>
+      <w:r>
+        <w:t xml:space="preserve">: remises commerciales non gouvernées, commissions Liaison qui grignotent la marge, exonérations « one-shot » devenues permanentes.</w:t>
       </w:r>
     </w:p>
     <w:p>
@@ -987,13 +1091,13 @@
           <w:b/>
           <w:bCs/>
         </w:rPr>
-        <w:t xml:space="preserve">Take rate effective</w:t>
-      </w:r>
-      <w:r>
-        <w:t xml:space="preserve"> </w:t>
-      </w:r>
-      <w:r>
-        <w:t xml:space="preserve">= commission affichée − (remises + impayés + fraude + rétro-commissions Liaison).</w:t>
+        <w:t xml:space="preserve">Impayés abonnement</w:t>
+      </w:r>
+      <w:r>
+        <w:t xml:space="preserve"> </w:t>
+      </w:r>
+      <w:r>
+        <w:t xml:space="preserve">: prélèvements Mobile Money échoués non relancés → MRR fantôme. Toute facture impayée &gt; 15 jours sort du MRR reconnu.</w:t>
       </w:r>
     </w:p>
     <w:p>
@@ -1009,13 +1113,13 @@
           <w:b/>
           <w:bCs/>
         </w:rPr>
-        <w:t xml:space="preserve">Véhicules actifs</w:t>
-      </w:r>
-      <w:r>
-        <w:t xml:space="preserve"> </w:t>
-      </w:r>
-      <w:r>
-        <w:t xml:space="preserve">= véhicules signés × (1 − churn) + expansion (upsell Pro → Pro +).</w:t>
+        <w:t xml:space="preserve">GMV qui fuit hors-plateforme</w:t>
+      </w:r>
+      <w:r>
+        <w:t xml:space="preserve"> </w:t>
+      </w:r>
+      <w:r>
+        <w:t xml:space="preserve">: mécanicien et vendeur qui se recontactent en direct après une première mise en relation (le « leakage WhatsApp »). C’est la fuite n°1 d’une marketplace. Mesure-la, combats-la (cf. §6.4).</w:t>
       </w:r>
     </w:p>
     <w:p>
@@ -1031,127 +1135,6 @@
           <w:b/>
           <w:bCs/>
         </w:rPr>
-        <w:t xml:space="preserve">ARPU abonnement</w:t>
-      </w:r>
-      <w:r>
-        <w:t xml:space="preserve"> </w:t>
-      </w:r>
-      <w:r>
-        <w:t xml:space="preserve">= mix Pro (5 000 F) / Pro + (10 000 F) × taux de recouvrement réel.</w:t>
-      </w:r>
-    </w:p>
-    <w:p>
-      <w:pPr>
-        <w:pStyle w:val="FirstParagraph"/>
-      </w:pPr>
-      <w:r>
-        <w:rPr>
-          <w:b/>
-          <w:bCs/>
-        </w:rPr>
-        <w:t xml:space="preserve">Chaque levier de ce développement est un projet CRO</w:t>
-      </w:r>
-      <w:r>
-        <w:t xml:space="preserve">. Si tu ne sais pas lequel bouger ce trimestre, tu n'as pas de plan.</w:t>
-      </w:r>
-    </w:p>
-    <w:bookmarkEnd w:id="14"/>
-    <w:bookmarkStart w:id="15" w:name="X593453b938e045be398ddf2b6d5f74f77238992"/>
-    <w:p>
-      <w:pPr>
-        <w:pStyle w:val="Heading3"/>
-      </w:pPr>
-      <w:r>
-        <w:t xml:space="preserve">2.3 Les fuites de revenu (revenue leakage) — la chasse permanente</w:t>
-      </w:r>
-    </w:p>
-    <w:p>
-      <w:pPr>
-        <w:pStyle w:val="FirstParagraph"/>
-      </w:pPr>
-      <w:r>
-        <w:t xml:space="preserve">Le revenu ne se perd pas qu'en haut du funnel. Audit mensuel obligatoire sur :</w:t>
-      </w:r>
-    </w:p>
-    <w:p>
-      <w:pPr>
-        <w:pStyle w:val="Compact"/>
-        <w:numPr>
-          <w:ilvl w:val="0"/>
-          <w:numId w:val="1004"/>
-        </w:numPr>
-      </w:pPr>
-      <w:r>
-        <w:rPr>
-          <w:b/>
-          <w:bCs/>
-        </w:rPr>
-        <w:t xml:space="preserve">Take rate erodée</w:t>
-      </w:r>
-      <w:r>
-        <w:t xml:space="preserve"> </w:t>
-      </w:r>
-      <w:r>
-        <w:t xml:space="preserve">: remises commerciales non gouvernées, commissions Liaison qui grignotent la marge, exonérations « one-shot » devenues permanentes.</w:t>
-      </w:r>
-    </w:p>
-    <w:p>
-      <w:pPr>
-        <w:pStyle w:val="Compact"/>
-        <w:numPr>
-          <w:ilvl w:val="0"/>
-          <w:numId w:val="1004"/>
-        </w:numPr>
-      </w:pPr>
-      <w:r>
-        <w:rPr>
-          <w:b/>
-          <w:bCs/>
-        </w:rPr>
-        <w:t xml:space="preserve">Impayés abonnement</w:t>
-      </w:r>
-      <w:r>
-        <w:t xml:space="preserve"> </w:t>
-      </w:r>
-      <w:r>
-        <w:t xml:space="preserve">: prélèvements Mobile Money échoués non relancés → MRR fantôme. Toute facture impayée &gt; 15 jours sort du MRR reconnu.</w:t>
-      </w:r>
-    </w:p>
-    <w:p>
-      <w:pPr>
-        <w:pStyle w:val="Compact"/>
-        <w:numPr>
-          <w:ilvl w:val="0"/>
-          <w:numId w:val="1004"/>
-        </w:numPr>
-      </w:pPr>
-      <w:r>
-        <w:rPr>
-          <w:b/>
-          <w:bCs/>
-        </w:rPr>
-        <w:t xml:space="preserve">GMV qui fuit hors-plateforme</w:t>
-      </w:r>
-      <w:r>
-        <w:t xml:space="preserve"> </w:t>
-      </w:r>
-      <w:r>
-        <w:t xml:space="preserve">: mécanicien et vendeur qui se recontactent en direct après une première mise en relation (le « leakage WhatsApp »). C'est la fuite n°1 d'une marketplace. Mesure-la, combats-la (cf. §6.4).</w:t>
-      </w:r>
-    </w:p>
-    <w:p>
-      <w:pPr>
-        <w:pStyle w:val="Compact"/>
-        <w:numPr>
-          <w:ilvl w:val="0"/>
-          <w:numId w:val="1004"/>
-        </w:numPr>
-      </w:pPr>
-      <w:r>
-        <w:rPr>
-          <w:b/>
-          <w:bCs/>
-        </w:rPr>
         <w:t xml:space="preserve">Downgrade silencieux</w:t>
       </w:r>
       <w:r>
@@ -1166,7 +1149,7 @@
         <w:pStyle w:val="Compact"/>
         <w:numPr>
           <w:ilvl w:val="0"/>
-          <w:numId w:val="1004"/>
+          <w:numId w:val="1003"/>
         </w:numPr>
       </w:pPr>
       <w:r>
@@ -1190,9 +1173,9 @@
         </w:pict>
       </w:r>
     </w:p>
-    <w:bookmarkEnd w:id="15"/>
-    <w:bookmarkEnd w:id="16"/>
-    <w:bookmarkStart w:id="20" w:name="Xeb0f807926d6a8ac7d9cd4a8d3e5b5e81d555bc"/>
+    <w:bookmarkEnd w:id="26"/>
+    <w:bookmarkEnd w:id="27"/>
+    <w:bookmarkStart w:id="31" w:name="stratégie-de-monétisation-la-doctrine"/>
     <w:p>
       <w:pPr>
         <w:pStyle w:val="Heading2"/>
@@ -1201,7 +1184,7 @@
         <w:t xml:space="preserve">3. Stratégie de monétisation — la doctrine</w:t>
       </w:r>
     </w:p>
-    <w:bookmarkStart w:id="17" w:name="Xbeb8aea7951e3bf657241e52ecd1c191d06579c"/>
+    <w:bookmarkStart w:id="28" w:name="X673f1d6bf527f30c02090a23d0d523f40ebc3cc"/>
     <w:p>
       <w:pPr>
         <w:pStyle w:val="Heading3"/>
@@ -1225,7 +1208,7 @@
           <w:b/>
           <w:bCs/>
         </w:rPr>
-        <w:t xml:space="preserve">les flottes paient pour l'intelligence (savoir où part l'argent) et le SLA (ne pas perdre une journée), pas pour des notifications.</w:t>
+        <w:t xml:space="preserve">les flottes paient pour l’intelligence (savoir où part l’argent) et l’urgence opérationnelle (ne pas perdre une journée), pas pour des notifications.</w:t>
       </w:r>
       <w:r>
         <w:t xml:space="preserve"> </w:t>
@@ -1239,7 +1222,7 @@
         <w:pStyle w:val="Compact"/>
         <w:numPr>
           <w:ilvl w:val="0"/>
-          <w:numId w:val="1005"/>
+          <w:numId w:val="1004"/>
         </w:numPr>
       </w:pPr>
       <w:r>
@@ -1269,7 +1252,7 @@
         <w:t xml:space="preserve"> </w:t>
       </w:r>
       <w:r>
-        <w:t xml:space="preserve">(intégrée, jamais un surcoût affiché au-dessus du prix vendeur) + breakdown transparent qui justifie la valeur (cf. DESIGN.md, breakdown obligatoire). On ne facture</w:t>
+        <w:t xml:space="preserve">(intégrée, jamais un surcoût affiché au-dessus du prix vendeur) + breakdown transparent qui justifie la valeur (cf. DESIGN.md, breakdown obligatoire). On ne facture</w:t>
       </w:r>
       <w:r>
         <w:t xml:space="preserve"> </w:t>
@@ -1285,15 +1268,15 @@
         <w:t xml:space="preserve"> </w:t>
       </w:r>
       <w:r>
-        <w:t xml:space="preserve">d'abonnement au mécanicien en phase d'acquisition.</w:t>
-      </w:r>
-    </w:p>
-    <w:p>
-      <w:pPr>
-        <w:pStyle w:val="Compact"/>
-        <w:numPr>
-          <w:ilvl w:val="0"/>
-          <w:numId w:val="1005"/>
+        <w:t xml:space="preserve">d’abonnement au mécanicien en phase d’acquisition.</w:t>
+      </w:r>
+    </w:p>
+    <w:p>
+      <w:pPr>
+        <w:pStyle w:val="Compact"/>
+        <w:numPr>
+          <w:ilvl w:val="0"/>
+          <w:numId w:val="1004"/>
         </w:numPr>
       </w:pPr>
       <w:r>
@@ -1307,7 +1290,7 @@
         <w:t xml:space="preserve"> </w:t>
       </w:r>
       <w:r>
-        <w:t xml:space="preserve">: sensible au coût total et à l'immobilisation. On monétise par</w:t>
+        <w:t xml:space="preserve">: sensible au coût total et à l’immobilisation. On monétise par</w:t>
       </w:r>
       <w:r>
         <w:t xml:space="preserve"> </w:t>
@@ -1323,15 +1306,15 @@
         <w:t xml:space="preserve"> </w:t>
       </w:r>
       <w:r>
-        <w:t xml:space="preserve">indexé sur la valeur du pilotage et du SLA, pas sur l'usage marketplace.</w:t>
-      </w:r>
-    </w:p>
-    <w:p>
-      <w:pPr>
-        <w:pStyle w:val="Compact"/>
-        <w:numPr>
-          <w:ilvl w:val="0"/>
-          <w:numId w:val="1005"/>
+        <w:t xml:space="preserve">indexé sur la valeur du pilotage et de l’urgence opérationnelle, pas sur l’usage marketplace.</w:t>
+      </w:r>
+    </w:p>
+    <w:p>
+      <w:pPr>
+        <w:pStyle w:val="Compact"/>
+        <w:numPr>
+          <w:ilvl w:val="0"/>
+          <w:numId w:val="1004"/>
         </w:numPr>
       </w:pPr>
       <w:r>
@@ -1380,8 +1363,8 @@
         <w:t xml:space="preserve">dès le premier mois.</w:t>
       </w:r>
     </w:p>
-    <w:bookmarkEnd w:id="17"/>
-    <w:bookmarkStart w:id="18" w:name="X9b38249c320b989e2996c71e12b64448fcecaa8"/>
+    <w:bookmarkEnd w:id="28"/>
+    <w:bookmarkStart w:id="29" w:name="la-règle-de-monétisation-segmentée"/>
     <w:p>
       <w:pPr>
         <w:pStyle w:val="Heading3"/>
@@ -1393,7 +1376,8 @@
     <w:tbl>
       <w:tblPr>
         <w:tblStyle w:val="Table"/>
-        <w:tblW w:type="auto" w:w="0"/>
+        <w:tblW w:type="pct" w:w="5000"/>
+        <w:tblLayout w:type="fixed"/>
         <w:tblLook w:firstRow="1" w:lastRow="0" w:firstColumn="0" w:lastColumn="0" w:noHBand="0" w:noVBand="0" w:val="0020"/>
       </w:tblPr>
       <w:tblGrid>
@@ -1446,7 +1430,7 @@
               <w:pStyle w:val="Compact"/>
             </w:pPr>
             <w:r>
-              <w:t xml:space="preserve">Ce qu'on NE facture jamais</w:t>
+              <w:t xml:space="preserve">Ce qu’on NE facture jamais</w:t>
             </w:r>
           </w:p>
         </w:tc>
@@ -1492,7 +1476,7 @@
               <w:pStyle w:val="Compact"/>
             </w:pPr>
             <w:r>
-              <w:t xml:space="preserve">Abonnement, frais d'inscription</w:t>
+              <w:t xml:space="preserve">Abonnement, frais d’inscription</w:t>
             </w:r>
           </w:p>
         </w:tc>
@@ -1584,7 +1568,7 @@
               <w:pStyle w:val="Compact"/>
             </w:pPr>
             <w:r>
-              <w:t xml:space="preserve">Frais de mise en service &gt; 1 mois d'abo</w:t>
+              <w:t xml:space="preserve">Frais de mise en service &gt; 1 mois d’abo</w:t>
             </w:r>
           </w:p>
         </w:tc>
@@ -1676,14 +1660,14 @@
               <w:pStyle w:val="Compact"/>
             </w:pPr>
             <w:r>
-              <w:t xml:space="preserve">Abonnement vendeur tant qu'on construit l'offre</w:t>
+              <w:t xml:space="preserve">Abonnement vendeur tant qu’on construit l’offre</w:t>
             </w:r>
           </w:p>
         </w:tc>
       </w:tr>
     </w:tbl>
-    <w:bookmarkEnd w:id="18"/>
-    <w:bookmarkStart w:id="19" w:name="X4427b243d81c190b735824570e871fd15653c34"/>
+    <w:bookmarkEnd w:id="29"/>
+    <w:bookmarkStart w:id="30" w:name="X01f5bf59990b97e6dea2538c4ffafc91d33ace0"/>
     <w:p>
       <w:pPr>
         <w:pStyle w:val="Heading3"/>
@@ -1726,7 +1710,7 @@
         <w:pStyle w:val="FirstParagraph"/>
       </w:pPr>
       <w:r>
-        <w:t xml:space="preserve">Chaque trimestre, la part de récurrent doit monter. C'est ce qui transforme un GMV joli mais volatil en une entreprise valorisable sur un multiple d'ARR.</w:t>
+        <w:t xml:space="preserve">Chaque trimestre, la part de récurrent doit monter. C’est ce qui transforme un GMV joli mais volatil en une entreprise valorisable sur un multiple d’ARR.</w:t>
       </w:r>
       <w:r>
         <w:t xml:space="preserve"> </w:t>
@@ -1746,9 +1730,9 @@
         </w:pict>
       </w:r>
     </w:p>
-    <w:bookmarkEnd w:id="19"/>
-    <w:bookmarkEnd w:id="20"/>
-    <w:bookmarkStart w:id="26" w:name="X353076d39ab32980c5c0131cbb388e7f3962e82"/>
+    <w:bookmarkEnd w:id="30"/>
+    <w:bookmarkEnd w:id="31"/>
+    <w:bookmarkStart w:id="37" w:name="pricing-le-laboratoire"/>
     <w:p>
       <w:pPr>
         <w:pStyle w:val="Heading2"/>
@@ -1757,7 +1741,7 @@
         <w:t xml:space="preserve">4. Pricing — le laboratoire</w:t>
       </w:r>
     </w:p>
-    <w:bookmarkStart w:id="21" w:name="X924c0bd8ee1059fa2a2b4c650c0cd6bbee9004d"/>
+    <w:bookmarkStart w:id="32" w:name="architecture-de-prix-actuelle-référence"/>
     <w:p>
       <w:pPr>
         <w:pStyle w:val="Heading3"/>
@@ -1771,6 +1755,208 @@
         <w:pStyle w:val="Compact"/>
         <w:numPr>
           <w:ilvl w:val="0"/>
+          <w:numId w:val="1005"/>
+        </w:numPr>
+      </w:pPr>
+      <w:r>
+        <w:rPr>
+          <w:b/>
+          <w:bCs/>
+        </w:rPr>
+        <w:t xml:space="preserve">Commission marketplace</w:t>
+      </w:r>
+      <w:r>
+        <w:t xml:space="preserve"> </w:t>
+      </w:r>
+      <w:r>
+        <w:t xml:space="preserve">: 5 à 10% côté vendeur, prélevée à l’escrow release. Le floor de commission Liaison reste</w:t>
+      </w:r>
+      <w:r>
+        <w:t xml:space="preserve"> </w:t>
+      </w:r>
+      <w:r>
+        <w:rPr>
+          <w:b/>
+          <w:bCs/>
+        </w:rPr>
+        <w:t xml:space="preserve">server-side</w:t>
+      </w:r>
+      <w:r>
+        <w:t xml:space="preserve">, jamais affiché comme recommandation UI (voir</w:t>
+      </w:r>
+      <w:r>
+        <w:t xml:space="preserve"> </w:t>
+      </w:r>
+      <w:r>
+        <w:rPr>
+          <w:rStyle w:val="VerbatimChar"/>
+        </w:rPr>
+        <w:t xml:space="preserve">memory/feedback-liaison-commission.md</w:t>
+      </w:r>
+      <w:r>
+        <w:t xml:space="preserve"> </w:t>
+      </w:r>
+      <w:r>
+        <w:t xml:space="preserve">— règle load-bearing : on observe ce que les vendeurs acceptent, on ne suggère pas de prix).</w:t>
+      </w:r>
+    </w:p>
+    <w:p>
+      <w:pPr>
+        <w:pStyle w:val="Compact"/>
+        <w:numPr>
+          <w:ilvl w:val="0"/>
+          <w:numId w:val="1005"/>
+        </w:numPr>
+      </w:pPr>
+      <w:r>
+        <w:rPr>
+          <w:b/>
+          <w:bCs/>
+        </w:rPr>
+        <w:t xml:space="preserve">Flotte Pro</w:t>
+      </w:r>
+      <w:r>
+        <w:t xml:space="preserve"> </w:t>
+      </w:r>
+      <w:r>
+        <w:t xml:space="preserve">: 5 000 F / véhicule / mois.</w:t>
+      </w:r>
+    </w:p>
+    <w:p>
+      <w:pPr>
+        <w:pStyle w:val="Compact"/>
+        <w:numPr>
+          <w:ilvl w:val="0"/>
+          <w:numId w:val="1005"/>
+        </w:numPr>
+      </w:pPr>
+      <w:r>
+        <w:rPr>
+          <w:b/>
+          <w:bCs/>
+        </w:rPr>
+        <w:t xml:space="preserve">Flotte Pro +</w:t>
+      </w:r>
+      <w:r>
+        <w:t xml:space="preserve"> </w:t>
+      </w:r>
+      <w:r>
+        <w:t xml:space="preserve">: 10 000 F / véhicule / mois (express prioritaire, urgence, support dédié).</w:t>
+      </w:r>
+    </w:p>
+    <w:p>
+      <w:pPr>
+        <w:pStyle w:val="Compact"/>
+        <w:numPr>
+          <w:ilvl w:val="0"/>
+          <w:numId w:val="1005"/>
+        </w:numPr>
+      </w:pPr>
+      <w:r>
+        <w:rPr>
+          <w:b/>
+          <w:bCs/>
+        </w:rPr>
+        <w:t xml:space="preserve">Pricing grand compte</w:t>
+      </w:r>
+      <w:r>
+        <w:t xml:space="preserve"> </w:t>
+      </w:r>
+      <w:r>
+        <w:t xml:space="preserve">: dégressif par volume (voir</w:t>
+      </w:r>
+      <w:r>
+        <w:t xml:space="preserve"> </w:t>
+      </w:r>
+      <w:r>
+        <w:rPr>
+          <w:rStyle w:val="VerbatimChar"/>
+        </w:rPr>
+        <w:t xml:space="preserve">pricing-flotte-2026-05-27.md</w:t>
+      </w:r>
+      <w:r>
+        <w:t xml:space="preserve">,</w:t>
+      </w:r>
+      <w:r>
+        <w:t xml:space="preserve"> </w:t>
+      </w:r>
+      <w:r>
+        <w:rPr>
+          <w:rStyle w:val="VerbatimChar"/>
+        </w:rPr>
+        <w:t xml:space="preserve">offre-vtc-6000-vehicules-2026-05.md</w:t>
+      </w:r>
+      <w:r>
+        <w:t xml:space="preserve">,</w:t>
+      </w:r>
+      <w:r>
+        <w:t xml:space="preserve"> </w:t>
+      </w:r>
+      <w:r>
+        <w:rPr>
+          <w:rStyle w:val="VerbatimChar"/>
+        </w:rPr>
+        <w:t xml:space="preserve">offre-btp-800-vehicules-2026-05.md</w:t>
+      </w:r>
+      <w:r>
+        <w:t xml:space="preserve">).</w:t>
+      </w:r>
+    </w:p>
+    <w:bookmarkEnd w:id="32"/>
+    <w:bookmarkStart w:id="33" w:name="X0710d20fe39acf55c11da1145d1d628e4005d48"/>
+    <w:p>
+      <w:pPr>
+        <w:pStyle w:val="Heading3"/>
+      </w:pPr>
+      <w:r>
+        <w:t xml:space="preserve">4.1bis La donnée prix concurrent (nouveau, 2026-05-29)</w:t>
+      </w:r>
+    </w:p>
+    <w:p>
+      <w:pPr>
+        <w:pStyle w:val="FirstParagraph"/>
+      </w:pPr>
+      <w:r>
+        <w:t xml:space="preserve">Depuis le 2026-05-29, le catalogue intègre</w:t>
+      </w:r>
+      <w:r>
+        <w:t xml:space="preserve"> </w:t>
+      </w:r>
+      <w:r>
+        <w:rPr>
+          <w:b/>
+          <w:bCs/>
+        </w:rPr>
+        <w:t xml:space="preserve">3 780 références prix de global-auto.online</w:t>
+      </w:r>
+      <w:r>
+        <w:t xml:space="preserve"> </w:t>
+      </w:r>
+      <w:r>
+        <w:t xml:space="preserve">(mises à jour via le scraper ingest, vendor « Global Auto », visibles publiquement). C’est notre</w:t>
+      </w:r>
+      <w:r>
+        <w:t xml:space="preserve"> </w:t>
+      </w:r>
+      <w:r>
+        <w:rPr>
+          <w:b/>
+          <w:bCs/>
+        </w:rPr>
+        <w:t xml:space="preserve">premier jeu de données prix concurrent live et structuré</w:t>
+      </w:r>
+      <w:r>
+        <w:t xml:space="preserve"> </w:t>
+      </w:r>
+      <w:r>
+        <w:t xml:space="preserve">— exploite-le :</w:t>
+      </w:r>
+    </w:p>
+    <w:p>
+      <w:pPr>
+        <w:pStyle w:val="Compact"/>
+        <w:numPr>
+          <w:ilvl w:val="0"/>
           <w:numId w:val="1006"/>
         </w:numPr>
       </w:pPr>
@@ -1779,41 +1965,13 @@
           <w:b/>
           <w:bCs/>
         </w:rPr>
-        <w:t xml:space="preserve">Commission marketplace</w:t>
-      </w:r>
-      <w:r>
-        <w:t xml:space="preserve"> </w:t>
-      </w:r>
-      <w:r>
-        <w:t xml:space="preserve">: 5 à 10% côté vendeur, prélevée à l'escrow release. Le floor de commission Liaison reste</w:t>
-      </w:r>
-      <w:r>
-        <w:t xml:space="preserve"> </w:t>
-      </w:r>
-      <w:r>
-        <w:rPr>
-          <w:b/>
-          <w:bCs/>
-        </w:rPr>
-        <w:t xml:space="preserve">server-side</w:t>
-      </w:r>
-      <w:r>
-        <w:t xml:space="preserve">, jamais affiché comme recommandation UI (voir</w:t>
-      </w:r>
-      <w:r>
-        <w:t xml:space="preserve"> </w:t>
-      </w:r>
-      <w:r>
-        <w:rPr>
-          <w:rStyle w:val="VerbatimChar"/>
-        </w:rPr>
-        <w:t xml:space="preserve">memory/feedback-liaison-commission.md</w:t>
-      </w:r>
-      <w:r>
-        <w:t xml:space="preserve"> </w:t>
-      </w:r>
-      <w:r>
-        <w:t xml:space="preserve">— règle load-bearing : on observe ce que les vendeurs acceptent, on ne suggère pas de prix).</w:t>
+        <w:t xml:space="preserve">Benchmark de take rate</w:t>
+      </w:r>
+      <w:r>
+        <w:t xml:space="preserve"> </w:t>
+      </w:r>
+      <w:r>
+        <w:t xml:space="preserve">: sur les références où on a un prix concurrent en face, mesurer notre prix vendeur effectif vs le leur → ajuster la commission par catégorie sans casser la compétitivité.</w:t>
       </w:r>
     </w:p>
     <w:p>
@@ -1829,13 +1987,13 @@
           <w:b/>
           <w:bCs/>
         </w:rPr>
-        <w:t xml:space="preserve">Flotte Pro</w:t>
-      </w:r>
-      <w:r>
-        <w:t xml:space="preserve"> </w:t>
-      </w:r>
-      <w:r>
-        <w:t xml:space="preserve">: 5 000 F / véhicule / mois.</w:t>
+        <w:t xml:space="preserve">Détection de leakage prix</w:t>
+      </w:r>
+      <w:r>
+        <w:t xml:space="preserve"> </w:t>
+      </w:r>
+      <w:r>
+        <w:t xml:space="preserve">: alerter quand une de nos lignes est significativement au-dessus du concurrent sur la même pièce (risque de désintermédiation, cf. §6.4).</w:t>
       </w:r>
     </w:p>
     <w:p>
@@ -1851,13 +2009,13 @@
           <w:b/>
           <w:bCs/>
         </w:rPr>
-        <w:t xml:space="preserve">Flotte Pro +</w:t>
-      </w:r>
-      <w:r>
-        <w:t xml:space="preserve"> </w:t>
-      </w:r>
-      <w:r>
-        <w:t xml:space="preserve">: 10 000 F / véhicule / mois (SLA 4h, urgence, support dédié).</w:t>
+        <w:t xml:space="preserve">Argument de vente flotte</w:t>
+      </w:r>
+      <w:r>
+        <w:t xml:space="preserve"> </w:t>
+      </w:r>
+      <w:r>
+        <w:t xml:space="preserve">: « voici l’écart de prix moyen vs le marché en ligne sur votre panier réel ».</w:t>
       </w:r>
     </w:p>
     <w:p>
@@ -1869,103 +2027,17 @@
         </w:numPr>
       </w:pPr>
       <w:r>
-        <w:rPr>
-          <w:b/>
-          <w:bCs/>
-        </w:rPr>
-        <w:t xml:space="preserve">Pricing grand compte</w:t>
-      </w:r>
-      <w:r>
-        <w:t xml:space="preserve"> </w:t>
-      </w:r>
-      <w:r>
-        <w:t xml:space="preserve">: dégressif par volume (voir</w:t>
-      </w:r>
-      <w:r>
-        <w:t xml:space="preserve"> </w:t>
-      </w:r>
-      <w:r>
-        <w:rPr>
-          <w:rStyle w:val="VerbatimChar"/>
-        </w:rPr>
-        <w:t xml:space="preserve">pricing-flotte-2026-05-27.md</w:t>
-      </w:r>
-      <w:r>
-        <w:t xml:space="preserve">,</w:t>
-      </w:r>
-      <w:r>
-        <w:t xml:space="preserve"> </w:t>
-      </w:r>
-      <w:r>
-        <w:rPr>
-          <w:rStyle w:val="VerbatimChar"/>
-        </w:rPr>
-        <w:t xml:space="preserve">offre-vtc-6000-vehicules-2026-05.md</w:t>
-      </w:r>
-      <w:r>
-        <w:t xml:space="preserve">,</w:t>
-      </w:r>
-      <w:r>
-        <w:t xml:space="preserve"> </w:t>
-      </w:r>
-      <w:r>
-        <w:rPr>
-          <w:rStyle w:val="VerbatimChar"/>
-        </w:rPr>
-        <w:t xml:space="preserve">offre-btp-800-vehicules-2026-05.md</w:t>
-      </w:r>
-      <w:r>
-        <w:t xml:space="preserve">).</w:t>
-      </w:r>
-    </w:p>
-    <w:bookmarkEnd w:id="21"/>
-    <w:bookmarkStart w:id="22" w:name="X267eea488fd1450c388dd08e9e72486e8939e74"/>
+        <w:t xml:space="preserve">Refresh périodique du scraper = la donnée reste fraîche (chantier ingest §3 CTO Bible).</w:t>
+      </w:r>
+    </w:p>
+    <w:bookmarkEnd w:id="33"/>
+    <w:bookmarkStart w:id="34" w:name="les-sept-leviers-de-pricing-à-tester"/>
     <w:p>
       <w:pPr>
         <w:pStyle w:val="Heading3"/>
       </w:pPr>
       <w:r>
-        <w:t xml:space="preserve">4.1bis La donnée prix concurrent (nouveau, 2026-05-29)</w:t>
-      </w:r>
-    </w:p>
-    <w:p>
-      <w:pPr>
-        <w:pStyle w:val="FirstParagraph"/>
-      </w:pPr>
-      <w:r>
-        <w:t xml:space="preserve">Depuis le 2026-05-29, le catalogue intègre</w:t>
-      </w:r>
-      <w:r>
-        <w:t xml:space="preserve"> </w:t>
-      </w:r>
-      <w:r>
-        <w:rPr>
-          <w:b/>
-          <w:bCs/>
-        </w:rPr>
-        <w:t xml:space="preserve">3 780 références prix de global-auto.online</w:t>
-      </w:r>
-      <w:r>
-        <w:t xml:space="preserve"> </w:t>
-      </w:r>
-      <w:r>
-        <w:t xml:space="preserve">(mises à jour via le scraper ingest, vendor « Global Auto », visibles publiquement). C'est notre</w:t>
-      </w:r>
-      <w:r>
-        <w:t xml:space="preserve"> </w:t>
-      </w:r>
-      <w:r>
-        <w:rPr>
-          <w:b/>
-          <w:bCs/>
-        </w:rPr>
-        <w:t xml:space="preserve">premier jeu de données prix concurrent live et structuré</w:t>
-      </w:r>
-      <w:r>
-        <w:t xml:space="preserve"> </w:t>
-      </w:r>
-      <w:r>
-        <w:t xml:space="preserve">— exploite-le :</w:t>
+        <w:t xml:space="preserve">4.2 Les sept leviers de pricing à tester</w:t>
       </w:r>
     </w:p>
     <w:p>
@@ -1981,13 +2053,13 @@
           <w:b/>
           <w:bCs/>
         </w:rPr>
-        <w:t xml:space="preserve">Benchmark de take rate</w:t>
-      </w:r>
-      <w:r>
-        <w:t xml:space="preserve"> </w:t>
-      </w:r>
-      <w:r>
-        <w:t xml:space="preserve">: sur les références où on a un prix concurrent en face, mesurer notre prix vendeur effectif vs le leur → ajuster la commission par catégorie sans casser la compétitivité.</w:t>
+        <w:t xml:space="preserve">Take rate variable par catégorie de pièce</w:t>
+      </w:r>
+      <w:r>
+        <w:t xml:space="preserve"> </w:t>
+      </w:r>
+      <w:r>
+        <w:t xml:space="preserve">: marge plus élevée sur ré-usiné/OEM (valeur + garantie) que sur l’occasion importée bas prix. Teste 6% / 8% / 10% par segment.</w:t>
       </w:r>
     </w:p>
     <w:p>
@@ -2003,13 +2075,13 @@
           <w:b/>
           <w:bCs/>
         </w:rPr>
-        <w:t xml:space="preserve">Détection de leakage prix</w:t>
-      </w:r>
-      <w:r>
-        <w:t xml:space="preserve"> </w:t>
-      </w:r>
-      <w:r>
-        <w:t xml:space="preserve">: alerter quand une de nos lignes est significativement au-dessus du concurrent sur la même pièce (risque de désintermédiation, cf. §6.4).</w:t>
+        <w:t xml:space="preserve">Take rate variable par condition</w:t>
+      </w:r>
+      <w:r>
+        <w:t xml:space="preserve"> </w:t>
+      </w:r>
+      <w:r>
+        <w:t xml:space="preserve">: la garantie Pièces vaut plus cher sur du neuf/OEM. Le chip condition (DESIGN.md) est aussi un signal de pricing.</w:t>
       </w:r>
     </w:p>
     <w:p>
@@ -2025,13 +2097,13 @@
           <w:b/>
           <w:bCs/>
         </w:rPr>
-        <w:t xml:space="preserve">Argument de vente flotte</w:t>
-      </w:r>
-      <w:r>
-        <w:t xml:space="preserve"> </w:t>
-      </w:r>
-      <w:r>
-        <w:t xml:space="preserve">: « voici l'écart de prix moyen vs le marché en ligne sur votre panier réel ».</w:t>
+        <w:t xml:space="preserve">Dégressivité abonnement par paliers de flotte</w:t>
+      </w:r>
+      <w:r>
+        <w:t xml:space="preserve"> </w:t>
+      </w:r>
+      <w:r>
+        <w:t xml:space="preserve">: 1–9 véhicules plein tarif, 10–49 / 50–199 / 200+ dégressifs. Optimiser le point de bascule pour maximiser le revenu total, pas le prix unitaire.</w:t>
       </w:r>
     </w:p>
     <w:p>
@@ -2043,94 +2115,6 @@
         </w:numPr>
       </w:pPr>
       <w:r>
-        <w:t xml:space="preserve">Refresh périodique du scraper = la donnée reste fraîche (chantier ingest §3 CTO Bible).</w:t>
-      </w:r>
-    </w:p>
-    <w:bookmarkEnd w:id="22"/>
-    <w:bookmarkStart w:id="23" w:name="Xbfcb9964733bd0d98705d1e37048695a906aad3"/>
-    <w:p>
-      <w:pPr>
-        <w:pStyle w:val="Heading3"/>
-      </w:pPr>
-      <w:r>
-        <w:t xml:space="preserve">4.2 Les sept leviers de pricing à tester</w:t>
-      </w:r>
-    </w:p>
-    <w:p>
-      <w:pPr>
-        <w:pStyle w:val="Compact"/>
-        <w:numPr>
-          <w:ilvl w:val="0"/>
-          <w:numId w:val="1008"/>
-        </w:numPr>
-      </w:pPr>
-      <w:r>
-        <w:rPr>
-          <w:b/>
-          <w:bCs/>
-        </w:rPr>
-        <w:t xml:space="preserve">Take rate variable par catégorie de pièce</w:t>
-      </w:r>
-      <w:r>
-        <w:t xml:space="preserve"> </w:t>
-      </w:r>
-      <w:r>
-        <w:t xml:space="preserve">: marge plus élevée sur ré-usiné/OEM (valeur + garantie) que sur l'occasion importée bas prix. Teste 6% / 8% / 10% par segment.</w:t>
-      </w:r>
-    </w:p>
-    <w:p>
-      <w:pPr>
-        <w:pStyle w:val="Compact"/>
-        <w:numPr>
-          <w:ilvl w:val="0"/>
-          <w:numId w:val="1008"/>
-        </w:numPr>
-      </w:pPr>
-      <w:r>
-        <w:rPr>
-          <w:b/>
-          <w:bCs/>
-        </w:rPr>
-        <w:t xml:space="preserve">Take rate variable par condition</w:t>
-      </w:r>
-      <w:r>
-        <w:t xml:space="preserve"> </w:t>
-      </w:r>
-      <w:r>
-        <w:t xml:space="preserve">: la garantie Pièces vaut plus cher sur du neuf/OEM. Le chip condition (DESIGN.md) est aussi un signal de pricing.</w:t>
-      </w:r>
-    </w:p>
-    <w:p>
-      <w:pPr>
-        <w:pStyle w:val="Compact"/>
-        <w:numPr>
-          <w:ilvl w:val="0"/>
-          <w:numId w:val="1008"/>
-        </w:numPr>
-      </w:pPr>
-      <w:r>
-        <w:rPr>
-          <w:b/>
-          <w:bCs/>
-        </w:rPr>
-        <w:t xml:space="preserve">Dégressivité abonnement par paliers de flotte</w:t>
-      </w:r>
-      <w:r>
-        <w:t xml:space="preserve"> </w:t>
-      </w:r>
-      <w:r>
-        <w:t xml:space="preserve">: 1–9 véhicules plein tarif, 10–49 / 50–199 / 200+ dégressifs. Optimiser le point de bascule pour maximiser le revenu total, pas le prix unitaire.</w:t>
-      </w:r>
-    </w:p>
-    <w:p>
-      <w:pPr>
-        <w:pStyle w:val="Compact"/>
-        <w:numPr>
-          <w:ilvl w:val="0"/>
-          <w:numId w:val="1008"/>
-        </w:numPr>
-      </w:pPr>
-      <w:r>
         <w:rPr>
           <w:b/>
           <w:bCs/>
@@ -2149,7 +2133,7 @@
         <w:pStyle w:val="Compact"/>
         <w:numPr>
           <w:ilvl w:val="0"/>
-          <w:numId w:val="1008"/>
+          <w:numId w:val="1007"/>
         </w:numPr>
       </w:pPr>
       <w:r>
@@ -2163,37 +2147,37 @@
         <w:t xml:space="preserve"> </w:t>
       </w:r>
       <w:r>
-        <w:t xml:space="preserve">: packager la conformité dans le Pro + plutôt que la facturer à part → augmente l'ARPU et la stickiness.</w:t>
-      </w:r>
-    </w:p>
-    <w:p>
-      <w:pPr>
-        <w:pStyle w:val="Compact"/>
-        <w:numPr>
-          <w:ilvl w:val="0"/>
-          <w:numId w:val="1008"/>
-        </w:numPr>
-      </w:pPr>
-      <w:r>
-        <w:rPr>
-          <w:b/>
-          <w:bCs/>
-        </w:rPr>
-        <w:t xml:space="preserve">Frais d'urgence à l'acte</w:t>
-      </w:r>
-      <w:r>
-        <w:t xml:space="preserve"> </w:t>
-      </w:r>
-      <w:r>
-        <w:t xml:space="preserve">: pour les non-abonnés, livraison express SLA 4h facturée à l'unité (porte d'entrée vers Pro +).</w:t>
-      </w:r>
-    </w:p>
-    <w:p>
-      <w:pPr>
-        <w:pStyle w:val="Compact"/>
-        <w:numPr>
-          <w:ilvl w:val="0"/>
-          <w:numId w:val="1008"/>
+        <w:t xml:space="preserve">: packager la conformité dans le Pro + plutôt que la facturer à part → augmente l’ARPU et la stickiness.</w:t>
+      </w:r>
+    </w:p>
+    <w:p>
+      <w:pPr>
+        <w:pStyle w:val="Compact"/>
+        <w:numPr>
+          <w:ilvl w:val="0"/>
+          <w:numId w:val="1007"/>
+        </w:numPr>
+      </w:pPr>
+      <w:r>
+        <w:rPr>
+          <w:b/>
+          <w:bCs/>
+        </w:rPr>
+        <w:t xml:space="preserve">Frais d’urgence à l’acte</w:t>
+      </w:r>
+      <w:r>
+        <w:t xml:space="preserve"> </w:t>
+      </w:r>
+      <w:r>
+        <w:t xml:space="preserve">: pour les non-abonnés, livraison express prioritaire facturée à l’unité (porte d’entrée vers Pro +).</w:t>
+      </w:r>
+    </w:p>
+    <w:p>
+      <w:pPr>
+        <w:pStyle w:val="Compact"/>
+        <w:numPr>
+          <w:ilvl w:val="0"/>
+          <w:numId w:val="1007"/>
         </w:numPr>
       </w:pPr>
       <w:r>
@@ -2207,11 +2191,11 @@
         <w:t xml:space="preserve"> </w:t>
       </w:r>
       <w:r>
-        <w:t xml:space="preserve">: commission minimale en valeur absolue sur les petits paniers (sinon les pièces à 3 000 F coûtent plus cher à servir qu'elles ne rapportent).</w:t>
-      </w:r>
-    </w:p>
-    <w:bookmarkEnd w:id="23"/>
-    <w:bookmarkStart w:id="24" w:name="X753b468a6d767427b72f804436f69d43ea679d8"/>
+        <w:t xml:space="preserve">: commission minimale en valeur absolue sur les petits paniers (sinon les pièces à 3 000 F coûtent plus cher à servir qu’elles ne rapportent).</w:t>
+      </w:r>
+    </w:p>
+    <w:bookmarkEnd w:id="34"/>
+    <w:bookmarkStart w:id="35" w:name="Xc11724698e440daffd34e99fd68885795ad556e"/>
     <w:p>
       <w:pPr>
         <w:pStyle w:val="Heading3"/>
@@ -2231,7 +2215,8 @@
     <w:tbl>
       <w:tblPr>
         <w:tblStyle w:val="Table"/>
-        <w:tblW w:type="auto" w:w="0"/>
+        <w:tblW w:type="pct" w:w="5000"/>
+        <w:tblLayout w:type="fixed"/>
         <w:tblLook w:firstRow="1" w:lastRow="0" w:firstColumn="0" w:lastColumn="0" w:noHBand="0" w:noVBand="0" w:val="0020"/>
       </w:tblPr>
       <w:tblGrid>
@@ -2423,6 +2408,82 @@
         <w:pStyle w:val="Compact"/>
         <w:numPr>
           <w:ilvl w:val="0"/>
+          <w:numId w:val="1008"/>
+        </w:numPr>
+      </w:pPr>
+      <w:r>
+        <w:rPr>
+          <w:b/>
+          <w:bCs/>
+        </w:rPr>
+        <w:t xml:space="preserve">Toute remise a une contrepartie.</w:t>
+      </w:r>
+      <w:r>
+        <w:t xml:space="preserve"> </w:t>
+      </w:r>
+      <w:r>
+        <w:t xml:space="preserve">Jamais de remise « pour signer ». Une remise sans contrepartie est une fuite de revenu permanente.</w:t>
+      </w:r>
+    </w:p>
+    <w:p>
+      <w:pPr>
+        <w:pStyle w:val="Compact"/>
+        <w:numPr>
+          <w:ilvl w:val="0"/>
+          <w:numId w:val="1008"/>
+        </w:numPr>
+      </w:pPr>
+      <w:r>
+        <w:rPr>
+          <w:b/>
+          <w:bCs/>
+        </w:rPr>
+        <w:t xml:space="preserve">Les remises pilote sont temporaires et datées.</w:t>
+      </w:r>
+      <w:r>
+        <w:t xml:space="preserve"> </w:t>
+      </w:r>
+      <w:r>
+        <w:t xml:space="preserve">Un pilote avec tarif préférentiel daté a une date de fin écrite dans le contrat et une bascule automatique au tarif plein. Le CRO traque la conversion pilote→payant comme un KPI dédié.</w:t>
+      </w:r>
+    </w:p>
+    <w:p>
+      <w:pPr>
+        <w:pStyle w:val="Compact"/>
+        <w:numPr>
+          <w:ilvl w:val="0"/>
+          <w:numId w:val="1008"/>
+        </w:numPr>
+      </w:pPr>
+      <w:r>
+        <w:rPr>
+          <w:b/>
+          <w:bCs/>
+        </w:rPr>
+        <w:t xml:space="preserve">Pas de remise sur la commission marketplace en early-stage.</w:t>
+      </w:r>
+      <w:r>
+        <w:t xml:space="preserve"> </w:t>
+      </w:r>
+      <w:r>
+        <w:t xml:space="preserve">La take rate est l’actif le plus dur à remonter une fois baissé.</w:t>
+      </w:r>
+    </w:p>
+    <w:bookmarkEnd w:id="35"/>
+    <w:bookmarkStart w:id="36" w:name="méthode-de-test-prix"/>
+    <w:p>
+      <w:pPr>
+        <w:pStyle w:val="Heading3"/>
+      </w:pPr>
+      <w:r>
+        <w:t xml:space="preserve">4.4 Méthode de test prix</w:t>
+      </w:r>
+    </w:p>
+    <w:p>
+      <w:pPr>
+        <w:pStyle w:val="Compact"/>
+        <w:numPr>
+          <w:ilvl w:val="0"/>
           <w:numId w:val="1009"/>
         </w:numPr>
       </w:pPr>
@@ -2431,13 +2492,13 @@
           <w:b/>
           <w:bCs/>
         </w:rPr>
-        <w:t xml:space="preserve">Toute remise a une contrepartie.</w:t>
-      </w:r>
-      <w:r>
-        <w:t xml:space="preserve"> </w:t>
-      </w:r>
-      <w:r>
-        <w:t xml:space="preserve">Jamais de remise « pour signer ». Une remise sans contrepartie est une fuite de revenu permanente.</w:t>
+        <w:t xml:space="preserve">Jamais de big-bang.</w:t>
+      </w:r>
+      <w:r>
+        <w:t xml:space="preserve"> </w:t>
+      </w:r>
+      <w:r>
+        <w:t xml:space="preserve">Tout changement de prix se teste sur une cohorte (nouvelle ville, nouveau segment, nouveaux clients) avant généralisation.</w:t>
       </w:r>
     </w:p>
     <w:p>
@@ -2453,13 +2514,13 @@
           <w:b/>
           <w:bCs/>
         </w:rPr>
-        <w:t xml:space="preserve">Les remises pilote sont temporaires et datées.</w:t>
-      </w:r>
-      <w:r>
-        <w:t xml:space="preserve"> </w:t>
-      </w:r>
-      <w:r>
-        <w:t xml:space="preserve">Un pilote « 3 mois gratuits » a une date de fin écrite dans le contrat et une bascule automatique au tarif plein. Le CRO traque la conversion pilote→payant comme un KPI dédié.</w:t>
+        <w:t xml:space="preserve">Grandfathering</w:t>
+      </w:r>
+      <w:r>
+        <w:t xml:space="preserve"> </w:t>
+      </w:r>
+      <w:r>
+        <w:t xml:space="preserve">: les clients existants gardent leur prix sur la durée de l’engagement en cours, montent au renouvellement. On ne casse pas la confiance pour gratter 5%.</w:t>
       </w:r>
     </w:p>
     <w:p>
@@ -2468,82 +2529,6 @@
         <w:numPr>
           <w:ilvl w:val="0"/>
           <w:numId w:val="1009"/>
-        </w:numPr>
-      </w:pPr>
-      <w:r>
-        <w:rPr>
-          <w:b/>
-          <w:bCs/>
-        </w:rPr>
-        <w:t xml:space="preserve">Pas de remise sur la commission marketplace en early-stage.</w:t>
-      </w:r>
-      <w:r>
-        <w:t xml:space="preserve"> </w:t>
-      </w:r>
-      <w:r>
-        <w:t xml:space="preserve">La take rate est l'actif le plus dur à remonter une fois baissé.</w:t>
-      </w:r>
-    </w:p>
-    <w:bookmarkEnd w:id="24"/>
-    <w:bookmarkStart w:id="25" w:name="Xdebcb3479a6458da1af4ac0eb8836b1e8b186f3"/>
-    <w:p>
-      <w:pPr>
-        <w:pStyle w:val="Heading3"/>
-      </w:pPr>
-      <w:r>
-        <w:t xml:space="preserve">4.4 Méthode de test prix</w:t>
-      </w:r>
-    </w:p>
-    <w:p>
-      <w:pPr>
-        <w:pStyle w:val="Compact"/>
-        <w:numPr>
-          <w:ilvl w:val="0"/>
-          <w:numId w:val="1010"/>
-        </w:numPr>
-      </w:pPr>
-      <w:r>
-        <w:rPr>
-          <w:b/>
-          <w:bCs/>
-        </w:rPr>
-        <w:t xml:space="preserve">Jamais de big-bang.</w:t>
-      </w:r>
-      <w:r>
-        <w:t xml:space="preserve"> </w:t>
-      </w:r>
-      <w:r>
-        <w:t xml:space="preserve">Tout changement de prix se teste sur une cohorte (nouvelle ville, nouveau segment, nouveaux clients) avant généralisation.</w:t>
-      </w:r>
-    </w:p>
-    <w:p>
-      <w:pPr>
-        <w:pStyle w:val="Compact"/>
-        <w:numPr>
-          <w:ilvl w:val="0"/>
-          <w:numId w:val="1010"/>
-        </w:numPr>
-      </w:pPr>
-      <w:r>
-        <w:rPr>
-          <w:b/>
-          <w:bCs/>
-        </w:rPr>
-        <w:t xml:space="preserve">Grandfathering</w:t>
-      </w:r>
-      <w:r>
-        <w:t xml:space="preserve"> </w:t>
-      </w:r>
-      <w:r>
-        <w:t xml:space="preserve">: les clients existants gardent leur prix sur la durée de l'engagement en cours, montent au renouvellement. On ne casse pas la confiance pour gratter 5%.</w:t>
-      </w:r>
-    </w:p>
-    <w:p>
-      <w:pPr>
-        <w:pStyle w:val="Compact"/>
-        <w:numPr>
-          <w:ilvl w:val="0"/>
-          <w:numId w:val="1010"/>
         </w:numPr>
       </w:pPr>
       <w:r>
@@ -2567,9 +2552,9 @@
         </w:pict>
       </w:r>
     </w:p>
-    <w:bookmarkEnd w:id="25"/>
-    <w:bookmarkEnd w:id="26"/>
-    <w:bookmarkStart w:id="31" w:name="Xa2bdc78b08a43a4f6ba2c91a3f242e4779f581a"/>
+    <w:bookmarkEnd w:id="36"/>
+    <w:bookmarkEnd w:id="37"/>
+    <w:bookmarkStart w:id="42" w:name="Xca34cdfdf5f19a57a618f6dad5cafe3ad0c1abd"/>
     <w:p>
       <w:pPr>
         <w:pStyle w:val="Heading2"/>
@@ -2578,7 +2563,7 @@
         <w:t xml:space="preserve">5. La machine de vente — playbooks par segment</w:t>
       </w:r>
     </w:p>
-    <w:bookmarkStart w:id="27" w:name="Xaa488de7a02916409ff339f69806f502218fea9"/>
+    <w:bookmarkStart w:id="38" w:name="X8672724739fdd0ba871c3b0ab698d02590af9ad"/>
     <w:p>
       <w:pPr>
         <w:pStyle w:val="Heading3"/>
@@ -2620,7 +2605,7 @@
         <w:t xml:space="preserve"> </w:t>
       </w:r>
       <w:r>
-        <w:t xml:space="preserve">: 21 jours signature → pilote 30 jours → déploiement 60 jours.</w:t>
+        <w:t xml:space="preserve">: 21 jours signature → déploiement initial de 30 jours → déploiement 60 jours.</w:t>
       </w:r>
     </w:p>
     <w:p>
@@ -2640,15 +2625,15 @@
       <w:r>
         <w:t xml:space="preserve">:</w:t>
       </w:r>
-    </w:p>
-    <w:p>
-      <w:pPr>
-        <w:pStyle w:val="Compact"/>
-        <w:numPr>
-          <w:ilvl w:val="0"/>
-          <w:numId w:val="1011"/>
-        </w:numPr>
-      </w:pPr>
+      <w:r>
+        <w:t xml:space="preserve"> </w:t>
+      </w:r>
+      <w:r>
+        <w:t xml:space="preserve">1.</w:t>
+      </w:r>
+      <w:r>
+        <w:t xml:space="preserve"> </w:t>
+      </w:r>
       <w:r>
         <w:rPr>
           <w:b/>
@@ -2662,15 +2647,15 @@
       <w:r>
         <w:t xml:space="preserve">: Budget (paie déjà des pièces, oui), Authority (le gérant décide), Need (combien de véhicules immobilisés/mois ?), Timeline (douleur actuelle ?). Disqualifier vite les &lt; 10 véhicules sans douleur.</w:t>
       </w:r>
-    </w:p>
-    <w:p>
-      <w:pPr>
-        <w:pStyle w:val="Compact"/>
-        <w:numPr>
-          <w:ilvl w:val="0"/>
-          <w:numId w:val="1011"/>
-        </w:numPr>
-      </w:pPr>
+      <w:r>
+        <w:t xml:space="preserve"> </w:t>
+      </w:r>
+      <w:r>
+        <w:t xml:space="preserve">2.</w:t>
+      </w:r>
+      <w:r>
+        <w:t xml:space="preserve"> </w:t>
+      </w:r>
       <w:r>
         <w:rPr>
           <w:b/>
@@ -2700,21 +2685,21 @@
       <w:r>
         <w:t xml:space="preserve">coût pièces actuel non piloté vs le dashboard Pièces. « Tu sais combien tu as dépensé en plaquettes ce trimestre ? Non. Nous oui. »</w:t>
       </w:r>
-    </w:p>
-    <w:p>
-      <w:pPr>
-        <w:pStyle w:val="Compact"/>
-        <w:numPr>
-          <w:ilvl w:val="0"/>
-          <w:numId w:val="1011"/>
-        </w:numPr>
-      </w:pPr>
-      <w:r>
-        <w:rPr>
-          <w:b/>
-          <w:bCs/>
-        </w:rPr>
-        <w:t xml:space="preserve">Pilote instrumenté</w:t>
+      <w:r>
+        <w:t xml:space="preserve"> </w:t>
+      </w:r>
+      <w:r>
+        <w:t xml:space="preserve">3.</w:t>
+      </w:r>
+      <w:r>
+        <w:t xml:space="preserve"> </w:t>
+      </w:r>
+      <w:r>
+        <w:rPr>
+          <w:b/>
+          <w:bCs/>
+        </w:rPr>
+        <w:t xml:space="preserve">Déploiement initial instrumenté</w:t>
       </w:r>
       <w:r>
         <w:t xml:space="preserve"> </w:t>
@@ -2736,17 +2721,17 @@
         <w:t xml:space="preserve"> </w:t>
       </w:r>
       <w:r>
-        <w:t xml:space="preserve">(−18 à −25% budget pièces, X jours d'immobilisation évités).</w:t>
-      </w:r>
-    </w:p>
-    <w:p>
-      <w:pPr>
-        <w:pStyle w:val="Compact"/>
-        <w:numPr>
-          <w:ilvl w:val="0"/>
-          <w:numId w:val="1011"/>
-        </w:numPr>
-      </w:pPr>
+        <w:t xml:space="preserve">(−18 à −25% budget pièces, X jours d’immobilisation évités).</w:t>
+      </w:r>
+      <w:r>
+        <w:t xml:space="preserve"> </w:t>
+      </w:r>
+      <w:r>
+        <w:t xml:space="preserve">4.</w:t>
+      </w:r>
+      <w:r>
+        <w:t xml:space="preserve"> </w:t>
+      </w:r>
       <w:r>
         <w:rPr>
           <w:b/>
@@ -2758,17 +2743,17 @@
         <w:t xml:space="preserve"> </w:t>
       </w:r>
       <w:r>
-        <w:t xml:space="preserve">: à J+30, présenter le ROI réel mesuré. Le prix de l'abonnement doit être &lt; 1/5 de l'économie démontrée.</w:t>
-      </w:r>
-    </w:p>
-    <w:p>
-      <w:pPr>
-        <w:pStyle w:val="Compact"/>
-        <w:numPr>
-          <w:ilvl w:val="0"/>
-          <w:numId w:val="1011"/>
-        </w:numPr>
-      </w:pPr>
+        <w:t xml:space="preserve">: après le premier mois de mesure, présenter le ROI réel mesuré. Le prix de l’abonnement doit être &lt; 1/5 de l’économie démontrée.</w:t>
+      </w:r>
+      <w:r>
+        <w:t xml:space="preserve"> </w:t>
+      </w:r>
+      <w:r>
+        <w:t xml:space="preserve">5.</w:t>
+      </w:r>
+      <w:r>
+        <w:t xml:space="preserve"> </w:t>
+      </w:r>
       <w:r>
         <w:rPr>
           <w:b/>
@@ -2780,7 +2765,53 @@
         <w:t xml:space="preserve"> </w:t>
       </w:r>
       <w:r>
-        <w:t xml:space="preserve">: engagement 12 mois, onboarding ops cadré, premier prélèvement à J+30 de la signature.</w:t>
+        <w:t xml:space="preserve">: engagement 12 mois, onboarding ops cadré, premier prélèvement à 30 jours de la signature.</w:t>
+      </w:r>
+    </w:p>
+    <w:p>
+      <w:pPr>
+        <w:pStyle w:val="BodyText"/>
+      </w:pPr>
+      <w:r>
+        <w:rPr>
+          <w:b/>
+          <w:bCs/>
+        </w:rPr>
+        <w:t xml:space="preserve">Objection killers</w:t>
+      </w:r>
+      <w:r>
+        <w:t xml:space="preserve"> </w:t>
+      </w:r>
+      <w:r>
+        <w:t xml:space="preserve">:</w:t>
+      </w:r>
+      <w:r>
+        <w:t xml:space="preserve"> </w:t>
+      </w:r>
+      <w:r>
+        <w:t xml:space="preserve">- « C’est cher » → « C’est 5 000 F/mois contre 30 000 à 50 000 F par jour de véhicule immobilisé. Un seul véhicule sauvé par mois, c’est rentabilisé 6 fois. »</w:t>
+      </w:r>
+      <w:r>
+        <w:t xml:space="preserve"> </w:t>
+      </w:r>
+      <w:r>
+        <w:t xml:space="preserve">- « J’ai déjà mon mécanicien » → « On ne remplace pas ton mécanicien, on lui trouve la pièce moins chère et plus vite, et tu vois enfin où part ton argent. »</w:t>
+      </w:r>
+      <w:r>
+        <w:t xml:space="preserve"> </w:t>
+      </w:r>
+      <w:r>
+        <w:t xml:space="preserve">- « Je verrai plus tard » → déploiement initial instrumenté, ROI mesuré, zéro engagement avant la preuve.</w:t>
+      </w:r>
+    </w:p>
+    <w:bookmarkEnd w:id="38"/>
+    <w:bookmarkStart w:id="39" w:name="Xc6262be9114773d5ba7a231a2e5a5c11192f32d"/>
+    <w:p>
+      <w:pPr>
+        <w:pStyle w:val="Heading3"/>
+      </w:pPr>
+      <w:r>
+        <w:t xml:space="preserve">5.2 Vente grand compte (VTC plateformes, BTP, corporate)</w:t>
       </w:r>
     </w:p>
     <w:p>
@@ -2792,7 +2823,51 @@
           <w:b/>
           <w:bCs/>
         </w:rPr>
-        <w:t xml:space="preserve">Objection killers</w:t>
+        <w:t xml:space="preserve">Cycle long</w:t>
+      </w:r>
+      <w:r>
+        <w:t xml:space="preserve"> </w:t>
+      </w:r>
+      <w:r>
+        <w:t xml:space="preserve">: 3 à 6 mois. Profil AE senior, plusieurs interlocuteurs (gérant ops + DAF + parfois DG).</w:t>
+      </w:r>
+    </w:p>
+    <w:p>
+      <w:pPr>
+        <w:pStyle w:val="Compact"/>
+        <w:numPr>
+          <w:ilvl w:val="0"/>
+          <w:numId w:val="1010"/>
+        </w:numPr>
+      </w:pPr>
+      <w:r>
+        <w:rPr>
+          <w:b/>
+          <w:bCs/>
+        </w:rPr>
+        <w:t xml:space="preserve">Le DAF est ton allié, pas ton obstacle.</w:t>
+      </w:r>
+      <w:r>
+        <w:t xml:space="preserve"> </w:t>
+      </w:r>
+      <w:r>
+        <w:t xml:space="preserve">L’argument FNE-CI / récupération TVA parle directement à lui : « Vos chauffeurs achètent en cash → vous perdez 18% de TVA non récupérable. Avec Pièces, vous la récupérez. » (CEO Bible §5, mouvement 3).</w:t>
+      </w:r>
+    </w:p>
+    <w:p>
+      <w:pPr>
+        <w:pStyle w:val="Compact"/>
+        <w:numPr>
+          <w:ilvl w:val="0"/>
+          <w:numId w:val="1010"/>
+        </w:numPr>
+      </w:pPr>
+      <w:r>
+        <w:rPr>
+          <w:b/>
+          <w:bCs/>
+        </w:rPr>
+        <w:t xml:space="preserve">Documents existants</w:t>
       </w:r>
       <w:r>
         <w:t xml:space="preserve"> </w:t>
@@ -2800,51 +2875,107 @@
       <w:r>
         <w:t xml:space="preserve">:</w:t>
       </w:r>
-    </w:p>
-    <w:p>
-      <w:pPr>
-        <w:pStyle w:val="Compact"/>
-        <w:numPr>
-          <w:ilvl w:val="0"/>
-          <w:numId w:val="1012"/>
-        </w:numPr>
-      </w:pPr>
-      <w:r>
-        <w:t xml:space="preserve">« C'est cher » → « C'est 5 000 F/mois contre 30 000 à 50 000 F par jour de véhicule immobilisé. Un seul véhicule sauvé par mois, c'est rentabilisé 6 fois. »</w:t>
-      </w:r>
-    </w:p>
-    <w:p>
-      <w:pPr>
-        <w:pStyle w:val="Compact"/>
-        <w:numPr>
-          <w:ilvl w:val="0"/>
-          <w:numId w:val="1012"/>
-        </w:numPr>
-      </w:pPr>
-      <w:r>
-        <w:t xml:space="preserve">« J'ai déjà mon mécanicien » → « On ne remplace pas ton mécanicien, on lui trouve la pièce moins chère et plus vite, et tu vois enfin où part ton argent. »</w:t>
-      </w:r>
-    </w:p>
-    <w:p>
-      <w:pPr>
-        <w:pStyle w:val="Compact"/>
-        <w:numPr>
-          <w:ilvl w:val="0"/>
-          <w:numId w:val="1012"/>
-        </w:numPr>
-      </w:pPr>
-      <w:r>
-        <w:t xml:space="preserve">« Je verrai plus tard » → pilote gratuit 30 jours, ROI mesuré, zéro engagement avant la preuve.</w:t>
-      </w:r>
-    </w:p>
-    <w:bookmarkEnd w:id="27"/>
-    <w:bookmarkStart w:id="28" w:name="X8c95757e99dbac9e8bf02dc8d77d03165c29f92"/>
+      <w:r>
+        <w:t xml:space="preserve"> </w:t>
+      </w:r>
+      <w:r>
+        <w:rPr>
+          <w:rStyle w:val="VerbatimChar"/>
+        </w:rPr>
+        <w:t xml:space="preserve">brochure-vtc-grand-compte-2026-05</w:t>
+      </w:r>
+      <w:r>
+        <w:t xml:space="preserve">,</w:t>
+      </w:r>
+      <w:r>
+        <w:t xml:space="preserve"> </w:t>
+      </w:r>
+      <w:r>
+        <w:rPr>
+          <w:rStyle w:val="VerbatimChar"/>
+        </w:rPr>
+        <w:t xml:space="preserve">brochure-btp-grand-compte-2026-05</w:t>
+      </w:r>
+      <w:r>
+        <w:t xml:space="preserve">,</w:t>
+      </w:r>
+      <w:r>
+        <w:t xml:space="preserve"> </w:t>
+      </w:r>
+      <w:r>
+        <w:rPr>
+          <w:rStyle w:val="VerbatimChar"/>
+        </w:rPr>
+        <w:t xml:space="preserve">offre-vtc-6000-vehicules-2026-05</w:t>
+      </w:r>
+      <w:r>
+        <w:t xml:space="preserve">,</w:t>
+      </w:r>
+      <w:r>
+        <w:t xml:space="preserve"> </w:t>
+      </w:r>
+      <w:r>
+        <w:rPr>
+          <w:rStyle w:val="VerbatimChar"/>
+        </w:rPr>
+        <w:t xml:space="preserve">offre-btp-800-vehicules-2026-05</w:t>
+      </w:r>
+      <w:r>
+        <w:t xml:space="preserve">. Les utiliser, ne pas réinventer.</w:t>
+      </w:r>
+    </w:p>
+    <w:p>
+      <w:pPr>
+        <w:pStyle w:val="Compact"/>
+        <w:numPr>
+          <w:ilvl w:val="0"/>
+          <w:numId w:val="1010"/>
+        </w:numPr>
+      </w:pPr>
+      <w:r>
+        <w:rPr>
+          <w:b/>
+          <w:bCs/>
+        </w:rPr>
+        <w:t xml:space="preserve">Pricing</w:t>
+      </w:r>
+      <w:r>
+        <w:t xml:space="preserve"> </w:t>
+      </w:r>
+      <w:r>
+        <w:t xml:space="preserve">: Pro + par défaut sur BTP (disponibilité critique). Dégressif documenté. Toute dérogation passe la gouvernance remise (§4.3).</w:t>
+      </w:r>
+    </w:p>
+    <w:p>
+      <w:pPr>
+        <w:pStyle w:val="Compact"/>
+        <w:numPr>
+          <w:ilvl w:val="0"/>
+          <w:numId w:val="1010"/>
+        </w:numPr>
+      </w:pPr>
+      <w:r>
+        <w:rPr>
+          <w:b/>
+          <w:bCs/>
+        </w:rPr>
+        <w:t xml:space="preserve">Closing</w:t>
+      </w:r>
+      <w:r>
+        <w:t xml:space="preserve"> </w:t>
+      </w:r>
+      <w:r>
+        <w:t xml:space="preserve">: déploiement initial sur un sous-parc (50–100 véhicules), preuve, puis déploiement masse contractualisé par paliers.</w:t>
+      </w:r>
+    </w:p>
+    <w:bookmarkEnd w:id="39"/>
+    <w:bookmarkStart w:id="40" w:name="Xbd1517db3540a702866802468d82cd6d33d961a"/>
     <w:p>
       <w:pPr>
         <w:pStyle w:val="Heading3"/>
       </w:pPr>
       <w:r>
-        <w:t xml:space="preserve">5.2 Vente grand compte (VTC plateformes, BTP, corporate)</w:t>
+        <w:t xml:space="preserve">5.3 Partenariats plateformes VTC (Yango, Heetch, Treepz)</w:t>
       </w:r>
     </w:p>
     <w:p>
@@ -2852,163 +2983,51 @@
         <w:pStyle w:val="FirstParagraph"/>
       </w:pPr>
       <w:r>
-        <w:rPr>
-          <w:b/>
-          <w:bCs/>
-        </w:rPr>
-        <w:t xml:space="preserve">Cycle long</w:t>
-      </w:r>
-      <w:r>
-        <w:t xml:space="preserve"> </w:t>
-      </w:r>
-      <w:r>
-        <w:t xml:space="preserve">: 3 à 6 mois. Profil AE senior, plusieurs interlocuteurs (gérant ops + DAF + parfois DG).</w:t>
-      </w:r>
-    </w:p>
-    <w:p>
-      <w:pPr>
-        <w:pStyle w:val="Compact"/>
-        <w:numPr>
-          <w:ilvl w:val="0"/>
-          <w:numId w:val="1013"/>
-        </w:numPr>
-      </w:pPr>
-      <w:r>
-        <w:rPr>
-          <w:b/>
-          <w:bCs/>
-        </w:rPr>
-        <w:t xml:space="preserve">Le DAF est ton allié, pas ton obstacle.</w:t>
-      </w:r>
-      <w:r>
-        <w:t xml:space="preserve"> </w:t>
-      </w:r>
-      <w:r>
-        <w:t xml:space="preserve">L'argument FNE-CI / récupération TVA parle directement à lui : « Vos chauffeurs achètent en cash → vous perdez 18% de TVA non récupérable. Avec Pièces, vous la récupérez. » (CEO Bible §5, mouvement 3).</w:t>
-      </w:r>
-    </w:p>
-    <w:p>
-      <w:pPr>
-        <w:pStyle w:val="Compact"/>
-        <w:numPr>
-          <w:ilvl w:val="0"/>
-          <w:numId w:val="1013"/>
-        </w:numPr>
-      </w:pPr>
-      <w:r>
-        <w:rPr>
-          <w:b/>
-          <w:bCs/>
-        </w:rPr>
-        <w:t xml:space="preserve">Documents existants</w:t>
-      </w:r>
-      <w:r>
-        <w:t xml:space="preserve"> </w:t>
-      </w:r>
-      <w:r>
-        <w:t xml:space="preserve">:</w:t>
-      </w:r>
-      <w:r>
-        <w:t xml:space="preserve"> </w:t>
-      </w:r>
-      <w:r>
-        <w:rPr>
-          <w:rStyle w:val="VerbatimChar"/>
-        </w:rPr>
-        <w:t xml:space="preserve">brochure-vtc-grand-compte-2026-05</w:t>
-      </w:r>
-      <w:r>
-        <w:t xml:space="preserve">,</w:t>
-      </w:r>
-      <w:r>
-        <w:t xml:space="preserve"> </w:t>
-      </w:r>
-      <w:r>
-        <w:rPr>
-          <w:rStyle w:val="VerbatimChar"/>
-        </w:rPr>
-        <w:t xml:space="preserve">brochure-btp-grand-compte-2026-05</w:t>
-      </w:r>
-      <w:r>
-        <w:t xml:space="preserve">,</w:t>
-      </w:r>
-      <w:r>
-        <w:t xml:space="preserve"> </w:t>
-      </w:r>
-      <w:r>
-        <w:rPr>
-          <w:rStyle w:val="VerbatimChar"/>
-        </w:rPr>
-        <w:t xml:space="preserve">offre-vtc-6000-vehicules-2026-05</w:t>
-      </w:r>
-      <w:r>
-        <w:t xml:space="preserve">,</w:t>
-      </w:r>
-      <w:r>
-        <w:t xml:space="preserve"> </w:t>
-      </w:r>
-      <w:r>
-        <w:rPr>
-          <w:rStyle w:val="VerbatimChar"/>
-        </w:rPr>
-        <w:t xml:space="preserve">offre-btp-800-vehicules-2026-05</w:t>
-      </w:r>
-      <w:r>
-        <w:t xml:space="preserve">. Les utiliser, ne pas réinventer.</w:t>
-      </w:r>
-    </w:p>
-    <w:p>
-      <w:pPr>
-        <w:pStyle w:val="Compact"/>
-        <w:numPr>
-          <w:ilvl w:val="0"/>
-          <w:numId w:val="1013"/>
-        </w:numPr>
-      </w:pPr>
-      <w:r>
-        <w:rPr>
-          <w:b/>
-          <w:bCs/>
-        </w:rPr>
-        <w:t xml:space="preserve">Pricing</w:t>
-      </w:r>
-      <w:r>
-        <w:t xml:space="preserve"> </w:t>
-      </w:r>
-      <w:r>
-        <w:t xml:space="preserve">: Pro + par défaut sur BTP (disponibilité critique). Dégressif documenté. Toute dérogation passe la gouvernance remise (§4.3).</w:t>
-      </w:r>
-    </w:p>
-    <w:p>
-      <w:pPr>
-        <w:pStyle w:val="Compact"/>
-        <w:numPr>
-          <w:ilvl w:val="0"/>
-          <w:numId w:val="1013"/>
-        </w:numPr>
-      </w:pPr>
-      <w:r>
-        <w:rPr>
-          <w:b/>
-          <w:bCs/>
-        </w:rPr>
-        <w:t xml:space="preserve">Closing</w:t>
-      </w:r>
-      <w:r>
-        <w:t xml:space="preserve"> </w:t>
-      </w:r>
-      <w:r>
-        <w:t xml:space="preserve">: pilote sur un sous-parc (50–100 véhicules), preuve, puis déploiement masse contractualisé par paliers.</w:t>
-      </w:r>
-    </w:p>
-    <w:bookmarkEnd w:id="28"/>
-    <w:bookmarkStart w:id="29" w:name="X609530091b3e1be7366aa5a566f0ddefd9b1cef"/>
+        <w:t xml:space="preserve">Canal de volume, pas de marge unitaire. Modèle :</w:t>
+      </w:r>
+      <w:r>
+        <w:t xml:space="preserve"> </w:t>
+      </w:r>
+      <w:r>
+        <w:t xml:space="preserve">- Offre intégrée pour les conducteurs partenaires (API, voir CTO Bible).</w:t>
+      </w:r>
+      <w:r>
+        <w:t xml:space="preserve"> </w:t>
+      </w:r>
+      <w:r>
+        <w:t xml:space="preserve">- Revenue share si nécessaire pour débloquer le volume.</w:t>
+      </w:r>
+      <w:r>
+        <w:t xml:space="preserve"> </w:t>
+      </w:r>
+      <w:r>
+        <w:t xml:space="preserve">-</w:t>
+      </w:r>
+      <w:r>
+        <w:t xml:space="preserve"> </w:t>
+      </w:r>
+      <w:r>
+        <w:rPr>
+          <w:b/>
+          <w:bCs/>
+        </w:rPr>
+        <w:t xml:space="preserve">Attention</w:t>
+      </w:r>
+      <w:r>
+        <w:t xml:space="preserve"> </w:t>
+      </w:r>
+      <w:r>
+        <w:t xml:space="preserve">: un deal plateforme mal négocié peut diluer toute la take rate. Plancher de marge non négociable défini avant d’entrer en négociation.</w:t>
+      </w:r>
+    </w:p>
+    <w:bookmarkEnd w:id="40"/>
+    <w:bookmarkStart w:id="41" w:name="le-rôle-du-réseau-liaison-dans-le-revenu"/>
     <w:p>
       <w:pPr>
         <w:pStyle w:val="Heading3"/>
       </w:pPr>
       <w:r>
-        <w:t xml:space="preserve">5.3 Partenariats plateformes VTC (Yango, Heetch, Treepz)</w:t>
+        <w:t xml:space="preserve">5.4 Le rôle du réseau Liaison dans le revenu</w:t>
       </w:r>
     </w:p>
     <w:p>
@@ -3016,71 +3035,7 @@
         <w:pStyle w:val="FirstParagraph"/>
       </w:pPr>
       <w:r>
-        <w:t xml:space="preserve">Canal de volume, pas de marge unitaire. Modèle :</w:t>
-      </w:r>
-    </w:p>
-    <w:p>
-      <w:pPr>
-        <w:pStyle w:val="Compact"/>
-        <w:numPr>
-          <w:ilvl w:val="0"/>
-          <w:numId w:val="1014"/>
-        </w:numPr>
-      </w:pPr>
-      <w:r>
-        <w:t xml:space="preserve">Offre intégrée pour les conducteurs partenaires (API, voir CTO Bible).</w:t>
-      </w:r>
-    </w:p>
-    <w:p>
-      <w:pPr>
-        <w:pStyle w:val="Compact"/>
-        <w:numPr>
-          <w:ilvl w:val="0"/>
-          <w:numId w:val="1014"/>
-        </w:numPr>
-      </w:pPr>
-      <w:r>
-        <w:t xml:space="preserve">Revenue share si nécessaire pour débloquer le volume.</w:t>
-      </w:r>
-    </w:p>
-    <w:p>
-      <w:pPr>
-        <w:pStyle w:val="Compact"/>
-        <w:numPr>
-          <w:ilvl w:val="0"/>
-          <w:numId w:val="1014"/>
-        </w:numPr>
-      </w:pPr>
-      <w:r>
-        <w:rPr>
-          <w:b/>
-          <w:bCs/>
-        </w:rPr>
-        <w:t xml:space="preserve">Attention</w:t>
-      </w:r>
-      <w:r>
-        <w:t xml:space="preserve"> </w:t>
-      </w:r>
-      <w:r>
-        <w:t xml:space="preserve">: un deal plateforme mal négocié peut diluer toute la take rate. Plancher de marge non négociable défini avant d'entrer en négociation.</w:t>
-      </w:r>
-    </w:p>
-    <w:bookmarkEnd w:id="29"/>
-    <w:bookmarkStart w:id="30" w:name="X7fcf8ef262a9bb634140e746841caedfb593dc9"/>
-    <w:p>
-      <w:pPr>
-        <w:pStyle w:val="Heading3"/>
-      </w:pPr>
-      <w:r>
-        <w:t xml:space="preserve">5.4 Le rôle du réseau Liaison dans le revenu</w:t>
-      </w:r>
-    </w:p>
-    <w:p>
-      <w:pPr>
-        <w:pStyle w:val="FirstParagraph"/>
-      </w:pPr>
-      <w:r>
-        <w:t xml:space="preserve">Les Liaisons sourcent l'offre (vendeurs) mais sont aussi un</w:t>
+        <w:t xml:space="preserve">Les Liaisons sourcent l’offre (vendeurs) mais sont aussi un</w:t>
       </w:r>
       <w:r>
         <w:t xml:space="preserve"> </w:t>
@@ -3096,23 +3051,23 @@
         <w:t xml:space="preserve"> </w:t>
       </w:r>
       <w:r>
-        <w:t xml:space="preserve">: ils recommandent Pièces aux mécaniciens qu'ils croisent. Leur commission (3–5% sur ventes générées, floor server-side) est un</w:t>
-      </w:r>
-      <w:r>
-        <w:t xml:space="preserve"> </w:t>
-      </w:r>
-      <w:r>
-        <w:rPr>
-          <w:b/>
-          <w:bCs/>
-        </w:rPr>
-        <w:t xml:space="preserve">coût d'acquisition variable</w:t>
-      </w:r>
-      <w:r>
-        <w:t xml:space="preserve"> </w:t>
-      </w:r>
-      <w:r>
-        <w:t xml:space="preserve">qui doit rester sous le seuil de marge. Le CRO arbitre en continu : commission Liaison vs take rate vs marge nette. Si la commission Liaison + remises dépasse la take rate, la transaction perd de l'argent.</w:t>
+        <w:t xml:space="preserve">: ils recommandent Pièces aux mécaniciens qu’ils croisent. Leur commission (3–5% sur ventes générées, floor server-side) est un</w:t>
+      </w:r>
+      <w:r>
+        <w:t xml:space="preserve"> </w:t>
+      </w:r>
+      <w:r>
+        <w:rPr>
+          <w:b/>
+          <w:bCs/>
+        </w:rPr>
+        <w:t xml:space="preserve">coût d’acquisition variable</w:t>
+      </w:r>
+      <w:r>
+        <w:t xml:space="preserve"> </w:t>
+      </w:r>
+      <w:r>
+        <w:t xml:space="preserve">qui doit rester sous le seuil de marge. Le CRO arbitre en continu : commission Liaison vs take rate vs marge nette. Si la commission Liaison + remises dépasse la take rate, la transaction perd de l’argent.</w:t>
       </w:r>
     </w:p>
     <w:p>
@@ -3122,9 +3077,9 @@
         </w:pict>
       </w:r>
     </w:p>
-    <w:bookmarkEnd w:id="30"/>
-    <w:bookmarkEnd w:id="31"/>
-    <w:bookmarkStart w:id="36" w:name="Xed9896037dc5849041596de9934dfe50f004d47"/>
+    <w:bookmarkEnd w:id="41"/>
+    <w:bookmarkEnd w:id="42"/>
+    <w:bookmarkStart w:id="47" w:name="revenue-operations-la-prévisibilité"/>
     <w:p>
       <w:pPr>
         <w:pStyle w:val="Heading2"/>
@@ -3133,7 +3088,7 @@
         <w:t xml:space="preserve">6. Revenue Operations — la prévisibilité</w:t>
       </w:r>
     </w:p>
-    <w:bookmarkStart w:id="32" w:name="X34d56fc210e436b8bd51536052e677ced6f46bb"/>
+    <w:bookmarkStart w:id="43" w:name="le-funnel-et-ses-taux-de-conversion"/>
     <w:p>
       <w:pPr>
         <w:pStyle w:val="Heading3"/>
@@ -3158,15 +3113,15 @@
         <w:rPr>
           <w:rStyle w:val="VerbatimChar"/>
         </w:rPr>
-        <w:t xml:space="preserve">Lead → Qualifié (SQL) → Démo → Pilote → Signé → Déployé → Payant récurrent</w:t>
-      </w:r>
-    </w:p>
-    <w:p>
-      <w:pPr>
-        <w:pStyle w:val="Compact"/>
-        <w:numPr>
-          <w:ilvl w:val="0"/>
-          <w:numId w:val="1015"/>
+        <w:t xml:space="preserve">Lead → Qualifié (SQL) → Démo → Déploiement initial → Signé → Déployé → Payant récurrent</w:t>
+      </w:r>
+    </w:p>
+    <w:p>
+      <w:pPr>
+        <w:pStyle w:val="Compact"/>
+        <w:numPr>
+          <w:ilvl w:val="0"/>
+          <w:numId w:val="1011"/>
         </w:numPr>
       </w:pPr>
       <w:r>
@@ -3178,7 +3133,7 @@
         <w:pStyle w:val="Compact"/>
         <w:numPr>
           <w:ilvl w:val="0"/>
-          <w:numId w:val="1015"/>
+          <w:numId w:val="1011"/>
         </w:numPr>
       </w:pPr>
       <w:r>
@@ -3190,7 +3145,7 @@
         <w:pStyle w:val="Compact"/>
         <w:numPr>
           <w:ilvl w:val="0"/>
-          <w:numId w:val="1015"/>
+          <w:numId w:val="1011"/>
         </w:numPr>
       </w:pPr>
       <w:r>
@@ -3202,15 +3157,15 @@
         <w:pStyle w:val="Compact"/>
         <w:numPr>
           <w:ilvl w:val="0"/>
-          <w:numId w:val="1015"/>
-        </w:numPr>
-      </w:pPr>
-      <w:r>
-        <w:rPr>
-          <w:b/>
-          <w:bCs/>
-        </w:rPr>
-        <w:t xml:space="preserve">Pilote→Payant</w:t>
+          <w:numId w:val="1011"/>
+        </w:numPr>
+      </w:pPr>
+      <w:r>
+        <w:rPr>
+          <w:b/>
+          <w:bCs/>
+        </w:rPr>
+        <w:t xml:space="preserve">Déploiement initial→Payant</w:t>
       </w:r>
       <w:r>
         <w:t xml:space="preserve"> </w:t>
@@ -3219,8 +3174,8 @@
         <w:t xml:space="preserve">: le KPI le plus important du B2B. Sous 60% = problème de qualification ou de preuve.</w:t>
       </w:r>
     </w:p>
-    <w:bookmarkEnd w:id="32"/>
-    <w:bookmarkStart w:id="33" w:name="X5d8431d387cd36dfdd932be1ee02a3b10e0a1e7"/>
+    <w:bookmarkEnd w:id="43"/>
+    <w:bookmarkStart w:id="44" w:name="forecasting-la-discipline"/>
     <w:p>
       <w:pPr>
         <w:pStyle w:val="Heading3"/>
@@ -3234,7 +3189,7 @@
         <w:pStyle w:val="Compact"/>
         <w:numPr>
           <w:ilvl w:val="0"/>
-          <w:numId w:val="1016"/>
+          <w:numId w:val="1012"/>
         </w:numPr>
       </w:pPr>
       <w:r>
@@ -3272,7 +3227,7 @@
         <w:pStyle w:val="Compact"/>
         <w:numPr>
           <w:ilvl w:val="0"/>
-          <w:numId w:val="1016"/>
+          <w:numId w:val="1012"/>
         </w:numPr>
       </w:pPr>
       <w:r>
@@ -3284,7 +3239,7 @@
         <w:pStyle w:val="Compact"/>
         <w:numPr>
           <w:ilvl w:val="0"/>
-          <w:numId w:val="1016"/>
+          <w:numId w:val="1012"/>
         </w:numPr>
       </w:pPr>
       <w:r>
@@ -3298,11 +3253,11 @@
         <w:t xml:space="preserve"> </w:t>
       </w:r>
       <w:r>
-        <w:t xml:space="preserve">Avant ça, on construit l'historique. Un forecast non tenu détruit la crédibilité auprès du board et tue la planification cash.</w:t>
-      </w:r>
-    </w:p>
-    <w:bookmarkEnd w:id="33"/>
-    <w:bookmarkStart w:id="34" w:name="X12ed35d6de662255074152e1f1e00b1fdad94cf"/>
+        <w:t xml:space="preserve">Avant ça, on construit l’historique. Un forecast non tenu détruit la crédibilité auprès du board et tue la planification cash.</w:t>
+      </w:r>
+    </w:p>
+    <w:bookmarkEnd w:id="44"/>
+    <w:bookmarkStart w:id="45" w:name="le-crm-et-la-donnée-de-revenu"/>
     <w:p>
       <w:pPr>
         <w:pStyle w:val="Heading3"/>
@@ -3316,7 +3271,7 @@
         <w:pStyle w:val="Compact"/>
         <w:numPr>
           <w:ilvl w:val="0"/>
-          <w:numId w:val="1017"/>
+          <w:numId w:val="1013"/>
         </w:numPr>
       </w:pPr>
       <w:r>
@@ -3330,15 +3285,15 @@
         <w:t xml:space="preserve"> </w:t>
       </w:r>
       <w:r>
-        <w:t xml:space="preserve">sur le pipeline (un CRM, même léger — pas un Excel par AE). Sans ça, pas de forecast, pas de coaching, pas d'attribution.</w:t>
-      </w:r>
-    </w:p>
-    <w:p>
-      <w:pPr>
-        <w:pStyle w:val="Compact"/>
-        <w:numPr>
-          <w:ilvl w:val="0"/>
-          <w:numId w:val="1017"/>
+        <w:t xml:space="preserve">sur le pipeline (un CRM, même léger — pas un Excel par AE). Sans ça, pas de forecast, pas de coaching, pas d’attribution.</w:t>
+      </w:r>
+    </w:p>
+    <w:p>
+      <w:pPr>
+        <w:pStyle w:val="Compact"/>
+        <w:numPr>
+          <w:ilvl w:val="0"/>
+          <w:numId w:val="1013"/>
         </w:numPr>
       </w:pPr>
       <w:r>
@@ -3360,15 +3315,15 @@
         <w:pStyle w:val="Compact"/>
         <w:numPr>
           <w:ilvl w:val="0"/>
-          <w:numId w:val="1017"/>
+          <w:numId w:val="1013"/>
         </w:numPr>
       </w:pPr>
       <w:r>
         <w:t xml:space="preserve">Réconciliation mensuelle CRM ↔ facturation ↔ encaissement réel. Le revenu reconnu = le revenu encaissé, pas le revenu signé.</w:t>
       </w:r>
     </w:p>
-    <w:bookmarkEnd w:id="34"/>
-    <w:bookmarkStart w:id="35" w:name="X33f00cdcbcb03fcfa0d27de6a1b0f2baf0623a0"/>
+    <w:bookmarkEnd w:id="45"/>
+    <w:bookmarkStart w:id="46" w:name="X1866e40280160769318c8734ddc07803fba7301"/>
     <w:p>
       <w:pPr>
         <w:pStyle w:val="Heading3"/>
@@ -3382,17 +3337,17 @@
         <w:pStyle w:val="FirstParagraph"/>
       </w:pPr>
       <w:r>
-        <w:t xml:space="preserve">La fuite hors-plateforme est la menace existentielle d'une marketplace. Tactiques :</w:t>
-      </w:r>
-    </w:p>
-    <w:p>
-      <w:pPr>
-        <w:pStyle w:val="Compact"/>
-        <w:numPr>
-          <w:ilvl w:val="0"/>
-          <w:numId w:val="1018"/>
-        </w:numPr>
-      </w:pPr>
+        <w:t xml:space="preserve">La fuite hors-plateforme est la menace existentielle d’une marketplace. Tactiques :</w:t>
+      </w:r>
+      <w:r>
+        <w:t xml:space="preserve"> </w:t>
+      </w:r>
+      <w:r>
+        <w:t xml:space="preserve">-</w:t>
+      </w:r>
+      <w:r>
+        <w:t xml:space="preserve"> </w:t>
+      </w:r>
       <w:r>
         <w:rPr>
           <w:b/>
@@ -3404,17 +3359,17 @@
         <w:t xml:space="preserve"> </w:t>
       </w:r>
       <w:r>
-        <w:t xml:space="preserve">: la pièce achetée hors-plateforme n'est pas garantie. La garantie est la raison de rester.</w:t>
-      </w:r>
-    </w:p>
-    <w:p>
-      <w:pPr>
-        <w:pStyle w:val="Compact"/>
-        <w:numPr>
-          <w:ilvl w:val="0"/>
-          <w:numId w:val="1018"/>
-        </w:numPr>
-      </w:pPr>
+        <w:t xml:space="preserve">: la pièce achetée hors-plateforme n’est pas garantie. La garantie est la raison de rester.</w:t>
+      </w:r>
+      <w:r>
+        <w:t xml:space="preserve"> </w:t>
+      </w:r>
+      <w:r>
+        <w:t xml:space="preserve">-</w:t>
+      </w:r>
+      <w:r>
+        <w:t xml:space="preserve"> </w:t>
+      </w:r>
       <w:r>
         <w:rPr>
           <w:b/>
@@ -3428,15 +3383,15 @@
       <w:r>
         <w:t xml:space="preserve">: le propriétaire et le DAF veulent la trace fiscale et la protection paiement.</w:t>
       </w:r>
-    </w:p>
-    <w:p>
-      <w:pPr>
-        <w:pStyle w:val="Compact"/>
-        <w:numPr>
-          <w:ilvl w:val="0"/>
-          <w:numId w:val="1018"/>
-        </w:numPr>
-      </w:pPr>
+      <w:r>
+        <w:t xml:space="preserve"> </w:t>
+      </w:r>
+      <w:r>
+        <w:t xml:space="preserve">-</w:t>
+      </w:r>
+      <w:r>
+        <w:t xml:space="preserve"> </w:t>
+      </w:r>
       <w:r>
         <w:rPr>
           <w:b/>
@@ -3450,15 +3405,15 @@
       <w:r>
         <w:t xml:space="preserve">: la valeur du dashboard disparaît si on achète à côté.</w:t>
       </w:r>
-    </w:p>
-    <w:p>
-      <w:pPr>
-        <w:pStyle w:val="Compact"/>
-        <w:numPr>
-          <w:ilvl w:val="0"/>
-          <w:numId w:val="1018"/>
-        </w:numPr>
-      </w:pPr>
+      <w:r>
+        <w:t xml:space="preserve"> </w:t>
+      </w:r>
+      <w:r>
+        <w:t xml:space="preserve">-</w:t>
+      </w:r>
+      <w:r>
+        <w:t xml:space="preserve"> </w:t>
+      </w:r>
       <w:r>
         <w:rPr>
           <w:b/>
@@ -3480,9 +3435,9 @@
         </w:pict>
       </w:r>
     </w:p>
-    <w:bookmarkEnd w:id="35"/>
-    <w:bookmarkEnd w:id="36"/>
-    <w:bookmarkStart w:id="41" w:name="Xbdb00aa6f5e61480962c3dfe03320ef373c698a"/>
+    <w:bookmarkEnd w:id="46"/>
+    <w:bookmarkEnd w:id="47"/>
+    <w:bookmarkStart w:id="52" w:name="Xe0f0ed7026c8068e1532b10e14ae6aa1a55d976"/>
     <w:p>
       <w:pPr>
         <w:pStyle w:val="Heading2"/>
@@ -3491,7 +3446,7 @@
         <w:t xml:space="preserve">7. Rétention, churn et expansion — où se gagne la vraie valeur</w:t>
       </w:r>
     </w:p>
-    <w:bookmarkStart w:id="37" w:name="X0e98ca8df283794c3365c232117d2f9d22abac5"/>
+    <w:bookmarkStart w:id="48" w:name="la-hiérarchie-de-la-valeur-revenue"/>
     <w:p>
       <w:pPr>
         <w:pStyle w:val="Heading3"/>
@@ -3515,17 +3470,17 @@
           <w:b/>
           <w:bCs/>
         </w:rPr>
-        <w:t xml:space="preserve">l'expansion (upsell/cross-sell) est le revenu le moins cher de tous.</w:t>
-      </w:r>
-      <w:r>
-        <w:t xml:space="preserve"> </w:t>
-      </w:r>
-      <w:r>
-        <w:t xml:space="preserve">Le CRO qui ne pilote que l'acquisition laisse l'argent le plus facile sur la table.</w:t>
-      </w:r>
-    </w:p>
-    <w:bookmarkEnd w:id="37"/>
-    <w:bookmarkStart w:id="38" w:name="Xf7ccd5887c59336f7709832fa4d0314fdb12ea0"/>
+        <w:t xml:space="preserve">l’expansion (upsell/cross-sell) est le revenu le moins cher de tous.</w:t>
+      </w:r>
+      <w:r>
+        <w:t xml:space="preserve"> </w:t>
+      </w:r>
+      <w:r>
+        <w:t xml:space="preserve">Le CRO qui ne pilote que l’acquisition laisse l’argent le plus facile sur la table.</w:t>
+      </w:r>
+    </w:p>
+    <w:bookmarkEnd w:id="48"/>
+    <w:bookmarkStart w:id="49" w:name="X00efda29924c68f207d2bc631680c3620fd9882"/>
     <w:p>
       <w:pPr>
         <w:pStyle w:val="Heading3"/>
@@ -3550,7 +3505,7 @@
         <w:pStyle w:val="Compact"/>
         <w:numPr>
           <w:ilvl w:val="0"/>
-          <w:numId w:val="1019"/>
+          <w:numId w:val="1014"/>
         </w:numPr>
       </w:pPr>
       <w:r>
@@ -3572,27 +3527,27 @@
         <w:pStyle w:val="Compact"/>
         <w:numPr>
           <w:ilvl w:val="0"/>
-          <w:numId w:val="1019"/>
-        </w:numPr>
-      </w:pPr>
-      <w:r>
-        <w:t xml:space="preserve">Leviers d'expansion : véhicules ajoutés à une flotte existante, upsell Pro → Pro +, attachement FNE-CI/data, montée du panier marketplace.</w:t>
-      </w:r>
-    </w:p>
-    <w:p>
-      <w:pPr>
-        <w:pStyle w:val="Compact"/>
-        <w:numPr>
-          <w:ilvl w:val="0"/>
-          <w:numId w:val="1019"/>
-        </w:numPr>
-      </w:pPr>
-      <w:r>
-        <w:t xml:space="preserve">Leviers anti-contraction : pilotage proactif des flottes qui réduisent leur parc, alertes sur baisse d'usage.</w:t>
-      </w:r>
-    </w:p>
-    <w:bookmarkEnd w:id="38"/>
-    <w:bookmarkStart w:id="39" w:name="X1497bbd1e9c49e22496a051f9f26cf396d03373"/>
+          <w:numId w:val="1014"/>
+        </w:numPr>
+      </w:pPr>
+      <w:r>
+        <w:t xml:space="preserve">Leviers d’expansion : véhicules ajoutés à une flotte existante, upsell Pro → Pro +, attachement FNE-CI/data, montée du panier marketplace.</w:t>
+      </w:r>
+    </w:p>
+    <w:p>
+      <w:pPr>
+        <w:pStyle w:val="Compact"/>
+        <w:numPr>
+          <w:ilvl w:val="0"/>
+          <w:numId w:val="1014"/>
+        </w:numPr>
+      </w:pPr>
+      <w:r>
+        <w:t xml:space="preserve">Leviers anti-contraction : pilotage proactif des flottes qui réduisent leur parc, alertes sur baisse d’usage.</w:t>
+      </w:r>
+    </w:p>
+    <w:bookmarkEnd w:id="49"/>
+    <w:bookmarkStart w:id="50" w:name="le-playbook-anti-churn-flotte"/>
     <w:p>
       <w:pPr>
         <w:pStyle w:val="Heading3"/>
@@ -3624,7 +3579,7 @@
         <w:pStyle w:val="Compact"/>
         <w:numPr>
           <w:ilvl w:val="0"/>
-          <w:numId w:val="1020"/>
+          <w:numId w:val="1015"/>
         </w:numPr>
       </w:pPr>
       <w:r>
@@ -3646,7 +3601,7 @@
         <w:pStyle w:val="Compact"/>
         <w:numPr>
           <w:ilvl w:val="0"/>
-          <w:numId w:val="1020"/>
+          <w:numId w:val="1015"/>
         </w:numPr>
       </w:pPr>
       <w:r>
@@ -3660,29 +3615,29 @@
         <w:t xml:space="preserve"> </w:t>
       </w:r>
       <w:r>
-        <w:t xml:space="preserve">: usage du dashboard, nombre de commandes via plateforme, tickets support, paiements à l'heure. Un score qui baisse = intervention avant le churn, pas après.</w:t>
-      </w:r>
-    </w:p>
-    <w:p>
-      <w:pPr>
-        <w:pStyle w:val="Compact"/>
-        <w:numPr>
-          <w:ilvl w:val="0"/>
-          <w:numId w:val="1020"/>
-        </w:numPr>
-      </w:pPr>
-      <w:r>
-        <w:rPr>
-          <w:b/>
-          <w:bCs/>
-        </w:rPr>
-        <w:t xml:space="preserve">Le SLA est le contrat moral.</w:t>
-      </w:r>
-      <w:r>
-        <w:t xml:space="preserve"> </w:t>
-      </w:r>
-      <w:r>
-        <w:t xml:space="preserve">Sur Pro +, un SLA 4h raté répété = churn garanti. Ne</w:t>
+        <w:t xml:space="preserve">: usage du dashboard, nombre de commandes via plateforme, tickets support, paiements à l’heure. Un score qui baisse = intervention avant le churn, pas après.</w:t>
+      </w:r>
+    </w:p>
+    <w:p>
+      <w:pPr>
+        <w:pStyle w:val="Compact"/>
+        <w:numPr>
+          <w:ilvl w:val="0"/>
+          <w:numId w:val="1015"/>
+        </w:numPr>
+      </w:pPr>
+      <w:r>
+        <w:rPr>
+          <w:b/>
+          <w:bCs/>
+        </w:rPr>
+        <w:t xml:space="preserve">L’engagement de livraison prioritaire est le contrat moral.</w:t>
+      </w:r>
+      <w:r>
+        <w:t xml:space="preserve"> </w:t>
+      </w:r>
+      <w:r>
+        <w:t xml:space="preserve">Sur Pro +, un engagement de livraison prioritaire raté répété = churn garanti. Ne</w:t>
       </w:r>
       <w:r>
         <w:t xml:space="preserve"> </w:t>
@@ -3698,15 +3653,15 @@
         <w:t xml:space="preserve"> </w:t>
       </w:r>
       <w:r>
-        <w:t xml:space="preserve">vendre du Pro + là où l'ops ne suit pas (cf. les 10 erreurs CEO Bible).</w:t>
-      </w:r>
-    </w:p>
-    <w:p>
-      <w:pPr>
-        <w:pStyle w:val="Compact"/>
-        <w:numPr>
-          <w:ilvl w:val="0"/>
-          <w:numId w:val="1020"/>
+        <w:t xml:space="preserve">vendre du Pro + là où l’ops ne suit pas (cf. les 10 erreurs CEO Bible).</w:t>
+      </w:r>
+    </w:p>
+    <w:p>
+      <w:pPr>
+        <w:pStyle w:val="Compact"/>
+        <w:numPr>
+          <w:ilvl w:val="0"/>
+          <w:numId w:val="1015"/>
         </w:numPr>
       </w:pPr>
       <w:r>
@@ -3720,11 +3675,11 @@
         <w:t xml:space="preserve"> </w:t>
       </w:r>
       <w:r>
-        <w:t xml:space="preserve">pour les comptes &gt; 50 véhicules : présenter les économies réalisées, c'est la justification du renouvellement et l'ouverture de l'upsell.</w:t>
-      </w:r>
-    </w:p>
-    <w:bookmarkEnd w:id="39"/>
-    <w:bookmarkStart w:id="40" w:name="X5ab8f9011771e12a282762a140bb3f16cd4a288"/>
+        <w:t xml:space="preserve">pour les comptes &gt; 50 véhicules : présenter les économies réalisées, c’est la justification du renouvellement et l’ouverture de l’upsell.</w:t>
+      </w:r>
+    </w:p>
+    <w:bookmarkEnd w:id="50"/>
+    <w:bookmarkStart w:id="51" w:name="expansion-marketplace"/>
     <w:p>
       <w:pPr>
         <w:pStyle w:val="Heading3"/>
@@ -3738,17 +3693,17 @@
         <w:pStyle w:val="FirstParagraph"/>
       </w:pPr>
       <w:r>
-        <w:t xml:space="preserve">Côté transactionnel, « l'expansion » c'est :</w:t>
-      </w:r>
-    </w:p>
-    <w:p>
-      <w:pPr>
-        <w:pStyle w:val="Compact"/>
-        <w:numPr>
-          <w:ilvl w:val="0"/>
-          <w:numId w:val="1021"/>
-        </w:numPr>
-      </w:pPr>
+        <w:t xml:space="preserve">Côté transactionnel, « l’expansion » c’est :</w:t>
+      </w:r>
+      <w:r>
+        <w:t xml:space="preserve"> </w:t>
+      </w:r>
+      <w:r>
+        <w:t xml:space="preserve">-</w:t>
+      </w:r>
+      <w:r>
+        <w:t xml:space="preserve"> </w:t>
+      </w:r>
       <w:r>
         <w:rPr>
           <w:b/>
@@ -3762,15 +3717,15 @@
       <w:r>
         <w:t xml:space="preserve">(objectif an 1 : 32 000 F) : suggestions de pièces complémentaires, kits (plaquettes + disques).</w:t>
       </w:r>
-    </w:p>
-    <w:p>
-      <w:pPr>
-        <w:pStyle w:val="Compact"/>
-        <w:numPr>
-          <w:ilvl w:val="0"/>
-          <w:numId w:val="1021"/>
-        </w:numPr>
-      </w:pPr>
+      <w:r>
+        <w:t xml:space="preserve"> </w:t>
+      </w:r>
+      <w:r>
+        <w:t xml:space="preserve">-</w:t>
+      </w:r>
+      <w:r>
+        <w:t xml:space="preserve"> </w:t>
+      </w:r>
       <w:r>
         <w:rPr>
           <w:b/>
@@ -3782,23 +3737,23 @@
         <w:t xml:space="preserve"> </w:t>
       </w:r>
       <w:r>
-        <w:t xml:space="preserve">: entretien préventif suggéré sur l'historique (P2 roadmap CTO).</w:t>
-      </w:r>
-    </w:p>
-    <w:p>
-      <w:pPr>
-        <w:pStyle w:val="Compact"/>
-        <w:numPr>
-          <w:ilvl w:val="0"/>
-          <w:numId w:val="1021"/>
-        </w:numPr>
-      </w:pPr>
-      <w:r>
-        <w:rPr>
-          <w:b/>
-          <w:bCs/>
-        </w:rPr>
-        <w:t xml:space="preserve">Augmenter le taux d'attachement</w:t>
+        <w:t xml:space="preserve">: entretien préventif suggéré sur l’historique (P2 roadmap CTO).</w:t>
+      </w:r>
+      <w:r>
+        <w:t xml:space="preserve"> </w:t>
+      </w:r>
+      <w:r>
+        <w:t xml:space="preserve">-</w:t>
+      </w:r>
+      <w:r>
+        <w:t xml:space="preserve"> </w:t>
+      </w:r>
+      <w:r>
+        <w:rPr>
+          <w:b/>
+          <w:bCs/>
+        </w:rPr>
+        <w:t xml:space="preserve">Augmenter le taux d’attachement</w:t>
       </w:r>
       <w:r>
         <w:t xml:space="preserve"> </w:t>
@@ -3814,9 +3769,9 @@
         </w:pict>
       </w:r>
     </w:p>
-    <w:bookmarkEnd w:id="40"/>
-    <w:bookmarkEnd w:id="41"/>
-    <w:bookmarkStart w:id="42" w:name="X0cfd33f7a61178eecdf4c55218ed11f139c9490"/>
+    <w:bookmarkEnd w:id="51"/>
+    <w:bookmarkEnd w:id="52"/>
+    <w:bookmarkStart w:id="53" w:name="Xe44cf58777fa2fcd8d26aa43d5c0568832e88b9"/>
     <w:p>
       <w:pPr>
         <w:pStyle w:val="Heading2"/>
@@ -3836,7 +3791,8 @@
     <w:tbl>
       <w:tblPr>
         <w:tblStyle w:val="Table"/>
-        <w:tblW w:type="auto" w:w="0"/>
+        <w:tblW w:type="pct" w:w="5000"/>
+        <w:tblLayout w:type="fixed"/>
         <w:tblLook w:firstRow="1" w:lastRow="0" w:firstColumn="0" w:lastColumn="0" w:noHBand="0" w:noVBand="0" w:val="0020"/>
       </w:tblPr>
       <w:tblGrid>
@@ -3982,7 +3938,7 @@
               <w:pStyle w:val="Compact"/>
             </w:pPr>
             <w:r>
-              <w:t xml:space="preserve">À volume, c'est le moteur transactionnel</w:t>
+              <w:t xml:space="preserve">À volume, c’est le moteur transactionnel</w:t>
             </w:r>
           </w:p>
         </w:tc>
@@ -4242,13 +4198,13 @@
           <w:b/>
           <w:bCs/>
         </w:rPr>
-        <w:t xml:space="preserve">Le test de santé d'un canal</w:t>
-      </w:r>
-      <w:r>
-        <w:t xml:space="preserve"> </w:t>
-      </w:r>
-      <w:r>
-        <w:t xml:space="preserve">: LTV/CAC &gt; 4 ET payback &lt; 9 mois ET marge brute positive après commission Liaison/remises. Si les trois ne sont pas verts, on ne scale pas le canal — on le répare ou on l'arrête.</w:t>
+        <w:t xml:space="preserve">Le test de santé d’un canal</w:t>
+      </w:r>
+      <w:r>
+        <w:t xml:space="preserve"> </w:t>
+      </w:r>
+      <w:r>
+        <w:t xml:space="preserve">: LTV/CAC &gt; 4 ET payback &lt; 9 mois ET marge brute positive après commission Liaison/remises. Si les trois ne sont pas verts, on ne scale pas le canal — on le répare ou on l’arrête.</w:t>
       </w:r>
     </w:p>
     <w:p>
@@ -4258,17 +4214,17 @@
         </w:pict>
       </w:r>
     </w:p>
-    <w:bookmarkEnd w:id="42"/>
-    <w:bookmarkStart w:id="47" w:name="X6937c52442fc94e4c8b90da5662fde7fddc97ca"/>
+    <w:bookmarkEnd w:id="53"/>
+    <w:bookmarkStart w:id="58" w:name="X032f894298c9d5ce6015cd0a021f72a2716425c"/>
     <w:p>
       <w:pPr>
         <w:pStyle w:val="Heading2"/>
       </w:pPr>
       <w:r>
-        <w:t xml:space="preserve">9. Organisation revenu — l'équipe à 12 et 24 mois</w:t>
-      </w:r>
-    </w:p>
-    <w:bookmarkStart w:id="43" w:name="Xf753c9671cbf2aa3a748f1dadc5c637239d5d13"/>
+        <w:t xml:space="preserve">9. Organisation revenu — l’équipe à 12 et 24 mois</w:t>
+      </w:r>
+    </w:p>
+    <w:bookmarkStart w:id="54" w:name="périmètre-cro"/>
     <w:p>
       <w:pPr>
         <w:pStyle w:val="Heading3"/>
@@ -4295,7 +4251,7 @@
         <w:t xml:space="preserve">Sales (B2B), Revenue Operations, Customer Success, Pricing, Partnerships</w:t>
       </w:r>
       <w:r>
-        <w:t xml:space="preserve">. Le marketing d'acquisition (demande mécanicien/particulier) peut être partagé avec le CEO/marketing selon le découpage retenu, mais le CRO en possède le</w:t>
+        <w:t xml:space="preserve">. Le marketing d’acquisition (demande mécanicien/particulier) peut être partagé avec le CEO/marketing selon le découpage retenu, mais le CRO en possède le</w:t>
       </w:r>
       <w:r>
         <w:t xml:space="preserve"> </w:t>
@@ -4326,7 +4282,7 @@
           <w:b/>
           <w:bCs/>
         </w:rPr>
-        <w:t xml:space="preserve">commission Liaison comme levier de coût d'acquisition</w:t>
+        <w:t xml:space="preserve">commission Liaison comme levier de coût d’acquisition</w:t>
       </w:r>
       <w:r>
         <w:t xml:space="preserve"> </w:t>
@@ -4348,11 +4304,11 @@
         <w:t xml:space="preserve"> </w:t>
       </w:r>
       <w:r>
-        <w:t xml:space="preserve">qu'il génère. Frontière à clarifier explicitement dès la prise de poste.</w:t>
-      </w:r>
-    </w:p>
-    <w:bookmarkEnd w:id="43"/>
-    <w:bookmarkStart w:id="44" w:name="X1d062f388a8eb325a7e6d90ef12a3f77dde4092"/>
+        <w:t xml:space="preserve">qu’il génère. Frontière à clarifier explicitement dès la prise de poste.</w:t>
+      </w:r>
+    </w:p>
+    <w:bookmarkEnd w:id="54"/>
+    <w:bookmarkStart w:id="55" w:name="équipe-revenu-m12"/>
     <w:p>
       <w:pPr>
         <w:pStyle w:val="Heading3"/>
@@ -4364,7 +4320,8 @@
     <w:tbl>
       <w:tblPr>
         <w:tblStyle w:val="Table"/>
-        <w:tblW w:type="auto" w:w="0"/>
+        <w:tblW w:type="pct" w:w="5000"/>
+        <w:tblLayout w:type="fixed"/>
         <w:tblLook w:firstRow="1" w:lastRow="0" w:firstColumn="0" w:lastColumn="0" w:noHBand="0" w:noVBand="0" w:val="0020"/>
       </w:tblPr>
       <w:tblGrid>
@@ -4551,8 +4508,8 @@
         </w:tc>
       </w:tr>
     </w:tbl>
-    <w:bookmarkEnd w:id="44"/>
-    <w:bookmarkStart w:id="45" w:name="X3670f8e490ff5d0bf15dfc5bb3e6b4affffeb05"/>
+    <w:bookmarkEnd w:id="55"/>
+    <w:bookmarkStart w:id="56" w:name="équipe-revenu-m24"/>
     <w:p>
       <w:pPr>
         <w:pStyle w:val="Heading3"/>
@@ -4569,14 +4526,14 @@
         <w:t xml:space="preserve">Ajouts : VP Sales, 2e CSM + CS manager, Pricing/RevOps analyst dédié, Partnerships manager (plateformes VTC + prescripteurs DAF/experts-comptables), SDR supplémentaires. Spécialisation par segment (VTC / BTP / corporate).</w:t>
       </w:r>
     </w:p>
-    <w:bookmarkEnd w:id="45"/>
-    <w:bookmarkStart w:id="46" w:name="X44ad3b8ef2955132f401f8a94c6b478fdf8e0f5"/>
+    <w:bookmarkEnd w:id="56"/>
+    <w:bookmarkStart w:id="57" w:name="X0aac19b6c832660beac3fdb67baf540dc11dcad"/>
     <w:p>
       <w:pPr>
         <w:pStyle w:val="Heading3"/>
       </w:pPr>
       <w:r>
-        <w:t xml:space="preserve">9.4 Plans de compensation — aligner l'argent sur le bon comportement</w:t>
+        <w:t xml:space="preserve">9.4 Plans de compensation — aligner l’argent sur le bon comportement</w:t>
       </w:r>
     </w:p>
     <w:p>
@@ -4592,15 +4549,15 @@
         <w:pStyle w:val="Compact"/>
         <w:numPr>
           <w:ilvl w:val="0"/>
-          <w:numId w:val="1022"/>
-        </w:numPr>
-      </w:pPr>
-      <w:r>
-        <w:rPr>
-          <w:b/>
-          <w:bCs/>
-        </w:rPr>
-        <w:t xml:space="preserve">L'AE est payé sur le revenu net signé, pondéré par la qualité</w:t>
+          <w:numId w:val="1016"/>
+        </w:numPr>
+      </w:pPr>
+      <w:r>
+        <w:rPr>
+          <w:b/>
+          <w:bCs/>
+        </w:rPr>
+        <w:t xml:space="preserve">L’AE est payé sur le revenu net signé, pondéré par la qualité</w:t>
       </w:r>
       <w:r>
         <w:t xml:space="preserve"> </w:t>
@@ -4630,26 +4587,26 @@
         <w:pStyle w:val="Compact"/>
         <w:numPr>
           <w:ilvl w:val="0"/>
-          <w:numId w:val="1022"/>
-        </w:numPr>
-      </w:pPr>
-      <w:r>
-        <w:rPr>
-          <w:b/>
-          <w:bCs/>
-        </w:rPr>
-        <w:t xml:space="preserve">Le CSM est payé sur la rétention nette (NRR) et l'expansion</w:t>
-      </w:r>
-      <w:r>
-        <w:t xml:space="preserve">, pas sur l'acquisition. C'est ce qui aligne le succès client sur la création de valeur.</w:t>
-      </w:r>
-    </w:p>
-    <w:p>
-      <w:pPr>
-        <w:pStyle w:val="Compact"/>
-        <w:numPr>
-          <w:ilvl w:val="0"/>
-          <w:numId w:val="1022"/>
+          <w:numId w:val="1016"/>
+        </w:numPr>
+      </w:pPr>
+      <w:r>
+        <w:rPr>
+          <w:b/>
+          <w:bCs/>
+        </w:rPr>
+        <w:t xml:space="preserve">Le CSM est payé sur la rétention nette (NRR) et l’expansion</w:t>
+      </w:r>
+      <w:r>
+        <w:t xml:space="preserve">, pas sur l’acquisition. C’est ce qui aligne le succès client sur la création de valeur.</w:t>
+      </w:r>
+    </w:p>
+    <w:p>
+      <w:pPr>
+        <w:pStyle w:val="Compact"/>
+        <w:numPr>
+          <w:ilvl w:val="0"/>
+          <w:numId w:val="1016"/>
         </w:numPr>
       </w:pPr>
       <w:r>
@@ -4668,7 +4625,7 @@
         <w:pStyle w:val="Compact"/>
         <w:numPr>
           <w:ilvl w:val="0"/>
-          <w:numId w:val="1022"/>
+          <w:numId w:val="1016"/>
         </w:numPr>
       </w:pPr>
       <w:r>
@@ -4682,15 +4639,15 @@
         <w:t xml:space="preserve"> </w:t>
       </w:r>
       <w:r>
-        <w:t xml:space="preserve">La commission se calcule sur le revenu net après remise, pour que l'AE ait intérêt à protéger le prix.</w:t>
-      </w:r>
-    </w:p>
-    <w:p>
-      <w:pPr>
-        <w:pStyle w:val="Compact"/>
-        <w:numPr>
-          <w:ilvl w:val="0"/>
-          <w:numId w:val="1022"/>
+        <w:t xml:space="preserve">La commission se calcule sur le revenu net après remise, pour que l’AE ait intérêt à protéger le prix.</w:t>
+      </w:r>
+    </w:p>
+    <w:p>
+      <w:pPr>
+        <w:pStyle w:val="Compact"/>
+        <w:numPr>
+          <w:ilvl w:val="0"/>
+          <w:numId w:val="1016"/>
         </w:numPr>
       </w:pPr>
       <w:r>
@@ -4711,9 +4668,9 @@
         </w:pict>
       </w:r>
     </w:p>
-    <w:bookmarkEnd w:id="46"/>
-    <w:bookmarkEnd w:id="47"/>
-    <w:bookmarkStart w:id="52" w:name="Xd31b8cfedc5dbc4440ab9b13e5560f9199a401d"/>
+    <w:bookmarkEnd w:id="57"/>
+    <w:bookmarkEnd w:id="58"/>
+    <w:bookmarkStart w:id="63" w:name="kpis-le-dashboard-cro"/>
     <w:p>
       <w:pPr>
         <w:pStyle w:val="Heading2"/>
@@ -4722,7 +4679,7 @@
         <w:t xml:space="preserve">10. KPIs — le dashboard CRO</w:t>
       </w:r>
     </w:p>
-    <w:bookmarkStart w:id="48" w:name="X186ac20277b1751e68f97129cf2dec3a6ce535a"/>
+    <w:bookmarkStart w:id="59" w:name="quotidien-revue-rapide-matin"/>
     <w:p>
       <w:pPr>
         <w:pStyle w:val="Heading3"/>
@@ -4736,7 +4693,7 @@
         <w:pStyle w:val="Compact"/>
         <w:numPr>
           <w:ilvl w:val="0"/>
-          <w:numId w:val="1023"/>
+          <w:numId w:val="1017"/>
         </w:numPr>
       </w:pPr>
       <w:r>
@@ -4748,7 +4705,7 @@
         <w:pStyle w:val="Compact"/>
         <w:numPr>
           <w:ilvl w:val="0"/>
-          <w:numId w:val="1023"/>
+          <w:numId w:val="1017"/>
         </w:numPr>
       </w:pPr>
       <w:r>
@@ -4760,15 +4717,15 @@
         <w:pStyle w:val="Compact"/>
         <w:numPr>
           <w:ilvl w:val="0"/>
-          <w:numId w:val="1023"/>
+          <w:numId w:val="1017"/>
         </w:numPr>
       </w:pPr>
       <w:r>
         <w:t xml:space="preserve">Prélèvements abonnement échoués (à relancer dans la journée).</w:t>
       </w:r>
     </w:p>
-    <w:bookmarkEnd w:id="48"/>
-    <w:bookmarkStart w:id="49" w:name="X98a5bfc8806274b8bec3d3b55c432cc5d443c85"/>
+    <w:bookmarkEnd w:id="59"/>
+    <w:bookmarkStart w:id="60" w:name="X39ead2b37ddb6c289b96d67f834000a96b90348"/>
     <w:p>
       <w:pPr>
         <w:pStyle w:val="Heading3"/>
@@ -4782,7 +4739,7 @@
         <w:pStyle w:val="Compact"/>
         <w:numPr>
           <w:ilvl w:val="0"/>
-          <w:numId w:val="1024"/>
+          <w:numId w:val="1018"/>
         </w:numPr>
       </w:pPr>
       <w:r>
@@ -4794,7 +4751,7 @@
         <w:pStyle w:val="Compact"/>
         <w:numPr>
           <w:ilvl w:val="0"/>
-          <w:numId w:val="1024"/>
+          <w:numId w:val="1018"/>
         </w:numPr>
       </w:pPr>
       <w:r>
@@ -4806,39 +4763,39 @@
         <w:pStyle w:val="Compact"/>
         <w:numPr>
           <w:ilvl w:val="0"/>
-          <w:numId w:val="1024"/>
-        </w:numPr>
-      </w:pPr>
-      <w:r>
-        <w:t xml:space="preserve">Conversion pilote→payant en cours.</w:t>
-      </w:r>
-    </w:p>
-    <w:p>
-      <w:pPr>
-        <w:pStyle w:val="Compact"/>
-        <w:numPr>
-          <w:ilvl w:val="0"/>
-          <w:numId w:val="1024"/>
-        </w:numPr>
-      </w:pPr>
-      <w:r>
-        <w:t xml:space="preserve">Health scores flotte en zone rouge → plan d'action.</w:t>
-      </w:r>
-    </w:p>
-    <w:p>
-      <w:pPr>
-        <w:pStyle w:val="Compact"/>
-        <w:numPr>
-          <w:ilvl w:val="0"/>
-          <w:numId w:val="1024"/>
+          <w:numId w:val="1018"/>
+        </w:numPr>
+      </w:pPr>
+      <w:r>
+        <w:t xml:space="preserve">Conversion déploiement initial→payant en cours.</w:t>
+      </w:r>
+    </w:p>
+    <w:p>
+      <w:pPr>
+        <w:pStyle w:val="Compact"/>
+        <w:numPr>
+          <w:ilvl w:val="0"/>
+          <w:numId w:val="1018"/>
+        </w:numPr>
+      </w:pPr>
+      <w:r>
+        <w:t xml:space="preserve">Health scores flotte en zone rouge → plan d’action.</w:t>
+      </w:r>
+    </w:p>
+    <w:p>
+      <w:pPr>
+        <w:pStyle w:val="Compact"/>
+        <w:numPr>
+          <w:ilvl w:val="0"/>
+          <w:numId w:val="1018"/>
         </w:numPr>
       </w:pPr>
       <w:r>
         <w:t xml:space="preserve">Take rate effective vs affichée (détection de leakage remise).</w:t>
       </w:r>
     </w:p>
-    <w:bookmarkEnd w:id="49"/>
-    <w:bookmarkStart w:id="50" w:name="X47effa3dd6c571dcd6ad63696319b377761d57d"/>
+    <w:bookmarkEnd w:id="60"/>
+    <w:bookmarkStart w:id="61" w:name="mensuel-board-pack-revenu"/>
     <w:p>
       <w:pPr>
         <w:pStyle w:val="Heading3"/>
@@ -4852,19 +4809,19 @@
         <w:pStyle w:val="Compact"/>
         <w:numPr>
           <w:ilvl w:val="0"/>
-          <w:numId w:val="1025"/>
-        </w:numPr>
-      </w:pPr>
-      <w:r>
-        <w:t xml:space="preserve">Revenu net total, split transactionnel / récurrent / service (et la tendance du mix — cf. §3.3).</w:t>
-      </w:r>
-    </w:p>
-    <w:p>
-      <w:pPr>
-        <w:pStyle w:val="Compact"/>
-        <w:numPr>
-          <w:ilvl w:val="0"/>
-          <w:numId w:val="1025"/>
+          <w:numId w:val="1019"/>
+        </w:numPr>
+      </w:pPr>
+      <w:r>
+        <w:t xml:space="preserve">Revenu net total, split transactionnel / récurrent / service (et la tendance du mix — cf. §3.3).</w:t>
+      </w:r>
+    </w:p>
+    <w:p>
+      <w:pPr>
+        <w:pStyle w:val="Compact"/>
+        <w:numPr>
+          <w:ilvl w:val="0"/>
+          <w:numId w:val="1019"/>
         </w:numPr>
       </w:pPr>
       <w:r>
@@ -4876,7 +4833,7 @@
         <w:pStyle w:val="Compact"/>
         <w:numPr>
           <w:ilvl w:val="0"/>
-          <w:numId w:val="1025"/>
+          <w:numId w:val="1019"/>
         </w:numPr>
       </w:pPr>
       <w:r>
@@ -4888,7 +4845,7 @@
         <w:pStyle w:val="Compact"/>
         <w:numPr>
           <w:ilvl w:val="0"/>
-          <w:numId w:val="1025"/>
+          <w:numId w:val="1019"/>
         </w:numPr>
       </w:pPr>
       <w:r>
@@ -4900,7 +4857,7 @@
         <w:pStyle w:val="Compact"/>
         <w:numPr>
           <w:ilvl w:val="0"/>
-          <w:numId w:val="1025"/>
+          <w:numId w:val="1019"/>
         </w:numPr>
       </w:pPr>
       <w:r>
@@ -4912,15 +4869,15 @@
         <w:pStyle w:val="Compact"/>
         <w:numPr>
           <w:ilvl w:val="0"/>
-          <w:numId w:val="1025"/>
+          <w:numId w:val="1019"/>
         </w:numPr>
       </w:pPr>
       <w:r>
         <w:t xml:space="preserve">Cohortes : rétention par cohorte de signature (la vérité sur la durabilité du revenu).</w:t>
       </w:r>
     </w:p>
-    <w:bookmarkEnd w:id="50"/>
-    <w:bookmarkStart w:id="51" w:name="Xfeee290f13f9d15c3fd6bfc2315c234cf242e45"/>
+    <w:bookmarkEnd w:id="61"/>
+    <w:bookmarkStart w:id="62" w:name="trimestriel-revue-stratégique-revenu"/>
     <w:p>
       <w:pPr>
         <w:pStyle w:val="Heading3"/>
@@ -4934,7 +4891,7 @@
         <w:pStyle w:val="Compact"/>
         <w:numPr>
           <w:ilvl w:val="0"/>
-          <w:numId w:val="1026"/>
+          <w:numId w:val="1020"/>
         </w:numPr>
       </w:pPr>
       <w:r>
@@ -4946,7 +4903,7 @@
         <w:pStyle w:val="Compact"/>
         <w:numPr>
           <w:ilvl w:val="0"/>
-          <w:numId w:val="1026"/>
+          <w:numId w:val="1020"/>
         </w:numPr>
       </w:pPr>
       <w:r>
@@ -4958,19 +4915,19 @@
         <w:pStyle w:val="Compact"/>
         <w:numPr>
           <w:ilvl w:val="0"/>
-          <w:numId w:val="1026"/>
-        </w:numPr>
-      </w:pPr>
-      <w:r>
-        <w:t xml:space="preserve">Performance par canal d'acquisition (réallocation budget).</w:t>
-      </w:r>
-    </w:p>
-    <w:p>
-      <w:pPr>
-        <w:pStyle w:val="Compact"/>
-        <w:numPr>
-          <w:ilvl w:val="0"/>
-          <w:numId w:val="1026"/>
+          <w:numId w:val="1020"/>
+        </w:numPr>
+      </w:pPr>
+      <w:r>
+        <w:t xml:space="preserve">Performance par canal d’acquisition (réallocation budget).</w:t>
+      </w:r>
+    </w:p>
+    <w:p>
+      <w:pPr>
+        <w:pStyle w:val="Compact"/>
+        <w:numPr>
+          <w:ilvl w:val="0"/>
+          <w:numId w:val="1020"/>
         </w:numPr>
       </w:pPr>
       <w:r>
@@ -4982,7 +4939,7 @@
         <w:pStyle w:val="Compact"/>
         <w:numPr>
           <w:ilvl w:val="0"/>
-          <w:numId w:val="1026"/>
+          <w:numId w:val="1020"/>
         </w:numPr>
       </w:pPr>
       <w:r>
@@ -4996,9 +4953,9 @@
         </w:pict>
       </w:r>
     </w:p>
-    <w:bookmarkEnd w:id="51"/>
-    <w:bookmarkEnd w:id="52"/>
-    <w:bookmarkStart w:id="56" w:name="X4df56cfbefd944f2a92d691e156655829ba1d21"/>
+    <w:bookmarkEnd w:id="62"/>
+    <w:bookmarkEnd w:id="63"/>
+    <w:bookmarkStart w:id="67" w:name="X3b636f1cd4a68973dfd7a3db647ae50707e1779"/>
     <w:p>
       <w:pPr>
         <w:pStyle w:val="Heading2"/>
@@ -5007,7 +4964,7 @@
         <w:t xml:space="preserve">11. Le plan de revenu — 90 jours, 12 mois, 24 mois</w:t>
       </w:r>
     </w:p>
-    <w:bookmarkStart w:id="53" w:name="X3606e6bda19f0813e93fb5d52ccca11d36f4aed"/>
+    <w:bookmarkStart w:id="64" w:name="les-90-premiers-jours-du-cro"/>
     <w:p>
       <w:pPr>
         <w:pStyle w:val="Heading3"/>
@@ -5027,46 +4984,28 @@
         </w:rPr>
         <w:t xml:space="preserve">Semaines 1–4 — Diagnostiquer</w:t>
       </w:r>
-    </w:p>
-    <w:p>
-      <w:pPr>
-        <w:pStyle w:val="Compact"/>
-        <w:numPr>
-          <w:ilvl w:val="0"/>
-          <w:numId w:val="1027"/>
-        </w:numPr>
-      </w:pPr>
-      <w:r>
-        <w:t xml:space="preserve">Cartographier les 4 flux, mesurer la take rate effective réelle (pas affichée), le MRR réel (net des impayés), le churn réel.</w:t>
-      </w:r>
-    </w:p>
-    <w:p>
-      <w:pPr>
-        <w:pStyle w:val="Compact"/>
-        <w:numPr>
-          <w:ilvl w:val="0"/>
-          <w:numId w:val="1027"/>
-        </w:numPr>
-      </w:pPr>
-      <w:r>
-        <w:t xml:space="preserve">Auditer le leakage (remises, impayés, disintermediation, sous-facturation FNE-CI).</w:t>
-      </w:r>
-    </w:p>
-    <w:p>
-      <w:pPr>
-        <w:pStyle w:val="Compact"/>
-        <w:numPr>
-          <w:ilvl w:val="0"/>
-          <w:numId w:val="1027"/>
-        </w:numPr>
-      </w:pPr>
-      <w:r>
-        <w:t xml:space="preserve">Mettre une source de vérité unique sur le pipeline (CRM léger).</w:t>
-      </w:r>
-    </w:p>
-    <w:p>
-      <w:pPr>
-        <w:pStyle w:val="FirstParagraph"/>
+      <w:r>
+        <w:t xml:space="preserve"> </w:t>
+      </w:r>
+      <w:r>
+        <w:t xml:space="preserve">- Cartographier les 4 flux, mesurer la take rate effective réelle (pas affichée), le MRR réel (net des impayés), le churn réel.</w:t>
+      </w:r>
+      <w:r>
+        <w:t xml:space="preserve"> </w:t>
+      </w:r>
+      <w:r>
+        <w:t xml:space="preserve">- Auditer le leakage (remises, impayés, disintermediation, sous-facturation FNE-CI).</w:t>
+      </w:r>
+      <w:r>
+        <w:t xml:space="preserve"> </w:t>
+      </w:r>
+      <w:r>
+        <w:t xml:space="preserve">- Mettre une source de vérité unique sur le pipeline (CRM léger).</w:t>
+      </w:r>
+    </w:p>
+    <w:p>
+      <w:pPr>
+        <w:pStyle w:val="BodyText"/>
       </w:pPr>
       <w:r>
         <w:rPr>
@@ -5075,46 +5014,28 @@
         </w:rPr>
         <w:t xml:space="preserve">Semaines 5–8 — Stabiliser</w:t>
       </w:r>
-    </w:p>
-    <w:p>
-      <w:pPr>
-        <w:pStyle w:val="Compact"/>
-        <w:numPr>
-          <w:ilvl w:val="0"/>
-          <w:numId w:val="1028"/>
-        </w:numPr>
-      </w:pPr>
-      <w:r>
-        <w:t xml:space="preserve">Instaurer la gouvernance des remises (§4.3) immédiatement — c'est la fuite la plus rapide à arrêter.</w:t>
-      </w:r>
-    </w:p>
-    <w:p>
-      <w:pPr>
-        <w:pStyle w:val="Compact"/>
-        <w:numPr>
-          <w:ilvl w:val="0"/>
-          <w:numId w:val="1028"/>
-        </w:numPr>
-      </w:pPr>
-      <w:r>
-        <w:t xml:space="preserve">Cadrer le playbook de vente flotte (§5.1) et le mesurer.</w:t>
-      </w:r>
-    </w:p>
-    <w:p>
-      <w:pPr>
-        <w:pStyle w:val="Compact"/>
-        <w:numPr>
-          <w:ilvl w:val="0"/>
-          <w:numId w:val="1028"/>
-        </w:numPr>
-      </w:pPr>
-      <w:r>
-        <w:t xml:space="preserve">Définir le health score flotte et lancer le suivi anti-churn.</w:t>
-      </w:r>
-    </w:p>
-    <w:p>
-      <w:pPr>
-        <w:pStyle w:val="FirstParagraph"/>
+      <w:r>
+        <w:t xml:space="preserve"> </w:t>
+      </w:r>
+      <w:r>
+        <w:t xml:space="preserve">- Instaurer la gouvernance des remises (§4.3) immédiatement — c’est la fuite la plus rapide à arrêter.</w:t>
+      </w:r>
+      <w:r>
+        <w:t xml:space="preserve"> </w:t>
+      </w:r>
+      <w:r>
+        <w:t xml:space="preserve">- Cadrer le playbook de vente flotte (§5.1) et le mesurer.</w:t>
+      </w:r>
+      <w:r>
+        <w:t xml:space="preserve"> </w:t>
+      </w:r>
+      <w:r>
+        <w:t xml:space="preserve">- Définir le health score flotte et lancer le suivi anti-churn.</w:t>
+      </w:r>
+    </w:p>
+    <w:p>
+      <w:pPr>
+        <w:pStyle w:val="BodyText"/>
       </w:pPr>
       <w:r>
         <w:rPr>
@@ -5123,57 +5044,33 @@
         </w:rPr>
         <w:t xml:space="preserve">Semaines 9–12 — Construire la prévisibilité</w:t>
       </w:r>
-    </w:p>
-    <w:p>
-      <w:pPr>
-        <w:pStyle w:val="Compact"/>
-        <w:numPr>
-          <w:ilvl w:val="0"/>
-          <w:numId w:val="1029"/>
-        </w:numPr>
-      </w:pPr>
-      <w:r>
-        <w:t xml:space="preserve">Premier forecast bottom-up formalisé.</w:t>
-      </w:r>
-    </w:p>
-    <w:p>
-      <w:pPr>
-        <w:pStyle w:val="Compact"/>
-        <w:numPr>
-          <w:ilvl w:val="0"/>
-          <w:numId w:val="1029"/>
-        </w:numPr>
-      </w:pPr>
-      <w:r>
-        <w:t xml:space="preserve">Comp plans alignés (§9.4).</w:t>
-      </w:r>
-    </w:p>
-    <w:p>
-      <w:pPr>
-        <w:pStyle w:val="Compact"/>
-        <w:numPr>
-          <w:ilvl w:val="0"/>
-          <w:numId w:val="1029"/>
-        </w:numPr>
-      </w:pPr>
-      <w:r>
-        <w:t xml:space="preserve">Premier test de pricing sur une cohorte.</w:t>
-      </w:r>
-    </w:p>
-    <w:p>
-      <w:pPr>
-        <w:pStyle w:val="Compact"/>
-        <w:numPr>
-          <w:ilvl w:val="0"/>
-          <w:numId w:val="1029"/>
-        </w:numPr>
-      </w:pPr>
-      <w:r>
-        <w:t xml:space="preserve">Premier QBR avec les plus gros comptes flotte.</w:t>
-      </w:r>
-    </w:p>
-    <w:bookmarkEnd w:id="53"/>
-    <w:bookmarkStart w:id="54" w:name="Xbccaf2aa33b13eb7a19374456a1ea52b47a0ed2"/>
+      <w:r>
+        <w:t xml:space="preserve"> </w:t>
+      </w:r>
+      <w:r>
+        <w:t xml:space="preserve">- Premier forecast bottom-up formalisé.</w:t>
+      </w:r>
+      <w:r>
+        <w:t xml:space="preserve"> </w:t>
+      </w:r>
+      <w:r>
+        <w:t xml:space="preserve">- Comp plans alignés (§9.4).</w:t>
+      </w:r>
+      <w:r>
+        <w:t xml:space="preserve"> </w:t>
+      </w:r>
+      <w:r>
+        <w:t xml:space="preserve">- Premier test de pricing sur une cohorte.</w:t>
+      </w:r>
+      <w:r>
+        <w:t xml:space="preserve"> </w:t>
+      </w:r>
+      <w:r>
+        <w:t xml:space="preserve">- Premier QBR avec les plus gros comptes flotte.</w:t>
+      </w:r>
+    </w:p>
+    <w:bookmarkEnd w:id="64"/>
+    <w:bookmarkStart w:id="65" w:name="objectifs-revenu-m12-alignés-ceo-bible"/>
     <w:p>
       <w:pPr>
         <w:pStyle w:val="Heading3"/>
@@ -5187,7 +5084,7 @@
         <w:pStyle w:val="Compact"/>
         <w:numPr>
           <w:ilvl w:val="0"/>
-          <w:numId w:val="1030"/>
+          <w:numId w:val="1021"/>
         </w:numPr>
       </w:pPr>
       <w:r>
@@ -5199,7 +5096,7 @@
         <w:pStyle w:val="Compact"/>
         <w:numPr>
           <w:ilvl w:val="0"/>
-          <w:numId w:val="1030"/>
+          <w:numId w:val="1021"/>
         </w:numPr>
       </w:pPr>
       <w:r>
@@ -5211,7 +5108,7 @@
         <w:pStyle w:val="Compact"/>
         <w:numPr>
           <w:ilvl w:val="0"/>
-          <w:numId w:val="1030"/>
+          <w:numId w:val="1021"/>
         </w:numPr>
       </w:pPr>
       <w:r>
@@ -5223,7 +5120,7 @@
         <w:pStyle w:val="Compact"/>
         <w:numPr>
           <w:ilvl w:val="0"/>
-          <w:numId w:val="1030"/>
+          <w:numId w:val="1021"/>
         </w:numPr>
       </w:pPr>
       <w:r>
@@ -5235,15 +5132,15 @@
         <w:pStyle w:val="Compact"/>
         <w:numPr>
           <w:ilvl w:val="0"/>
-          <w:numId w:val="1030"/>
+          <w:numId w:val="1021"/>
         </w:numPr>
       </w:pPr>
       <w:r>
         <w:t xml:space="preserve">Take rate effective ≥ 7,5% (après toutes fuites).</w:t>
       </w:r>
     </w:p>
-    <w:bookmarkEnd w:id="54"/>
-    <w:bookmarkStart w:id="55" w:name="Xae334d871577635d589ef9c298f0c1b88c75a08"/>
+    <w:bookmarkEnd w:id="65"/>
+    <w:bookmarkStart w:id="66" w:name="objectifs-revenu-m24"/>
     <w:p>
       <w:pPr>
         <w:pStyle w:val="Heading3"/>
@@ -5257,7 +5154,7 @@
         <w:pStyle w:val="Compact"/>
         <w:numPr>
           <w:ilvl w:val="0"/>
-          <w:numId w:val="1031"/>
+          <w:numId w:val="1022"/>
         </w:numPr>
       </w:pPr>
       <w:r>
@@ -5269,7 +5166,7 @@
         <w:pStyle w:val="Compact"/>
         <w:numPr>
           <w:ilvl w:val="0"/>
-          <w:numId w:val="1031"/>
+          <w:numId w:val="1022"/>
         </w:numPr>
       </w:pPr>
       <w:r>
@@ -5281,7 +5178,7 @@
         <w:pStyle w:val="Compact"/>
         <w:numPr>
           <w:ilvl w:val="0"/>
-          <w:numId w:val="1031"/>
+          <w:numId w:val="1022"/>
         </w:numPr>
       </w:pPr>
       <w:r>
@@ -5293,7 +5190,7 @@
         <w:pStyle w:val="Compact"/>
         <w:numPr>
           <w:ilvl w:val="0"/>
-          <w:numId w:val="1031"/>
+          <w:numId w:val="1022"/>
         </w:numPr>
       </w:pPr>
       <w:r>
@@ -5305,11 +5202,11 @@
         <w:pStyle w:val="Compact"/>
         <w:numPr>
           <w:ilvl w:val="0"/>
-          <w:numId w:val="1031"/>
-        </w:numPr>
-      </w:pPr>
-      <w:r>
-        <w:t xml:space="preserve">FNE-CI passé de levier d'acquisition à contributeur de marge mesurable.</w:t>
+          <w:numId w:val="1022"/>
+        </w:numPr>
+      </w:pPr>
+      <w:r>
+        <w:t xml:space="preserve">FNE-CI passé de levier d’acquisition à contributeur de marge mesurable.</w:t>
       </w:r>
     </w:p>
     <w:p>
@@ -5319,9 +5216,9 @@
         </w:pict>
       </w:r>
     </w:p>
-    <w:bookmarkEnd w:id="55"/>
-    <w:bookmarkEnd w:id="56"/>
-    <w:bookmarkStart w:id="57" w:name="X0d9c846e020985b430010318b64f3dd76e8a560"/>
+    <w:bookmarkEnd w:id="66"/>
+    <w:bookmarkEnd w:id="67"/>
+    <w:bookmarkStart w:id="68" w:name="Xe6509dc0747301ff6b7b75363150a0715c424aa"/>
     <w:p>
       <w:pPr>
         <w:pStyle w:val="Heading2"/>
@@ -5335,7 +5232,7 @@
         <w:pStyle w:val="Compact"/>
         <w:numPr>
           <w:ilvl w:val="0"/>
-          <w:numId w:val="1032"/>
+          <w:numId w:val="1023"/>
         </w:numPr>
       </w:pPr>
       <w:r>
@@ -5349,15 +5246,15 @@
         <w:t xml:space="preserve"> </w:t>
       </w:r>
       <w:r>
-        <w:t xml:space="preserve">Le revenu, c'est l'escrow released, pas la commande passée.</w:t>
-      </w:r>
-    </w:p>
-    <w:p>
-      <w:pPr>
-        <w:pStyle w:val="Compact"/>
-        <w:numPr>
-          <w:ilvl w:val="0"/>
-          <w:numId w:val="1032"/>
+        <w:t xml:space="preserve">Le revenu, c’est l’escrow released, pas la commande passée.</w:t>
+      </w:r>
+    </w:p>
+    <w:p>
+      <w:pPr>
+        <w:pStyle w:val="Compact"/>
+        <w:numPr>
+          <w:ilvl w:val="0"/>
+          <w:numId w:val="1023"/>
         </w:numPr>
       </w:pPr>
       <w:r>
@@ -5371,23 +5268,23 @@
         <w:t xml:space="preserve"> </w:t>
       </w:r>
       <w:r>
-        <w:t xml:space="preserve">Le prix le plus dur à remonter est celui qu'on a baissé.</w:t>
-      </w:r>
-    </w:p>
-    <w:p>
-      <w:pPr>
-        <w:pStyle w:val="Compact"/>
-        <w:numPr>
-          <w:ilvl w:val="0"/>
-          <w:numId w:val="1032"/>
-        </w:numPr>
-      </w:pPr>
-      <w:r>
-        <w:rPr>
-          <w:b/>
-          <w:bCs/>
-        </w:rPr>
-        <w:t xml:space="preserve">Vendre du Pro + sans capacité SLA prouvée.</w:t>
+        <w:t xml:space="preserve">Le prix le plus dur à remonter est celui qu’on a baissé.</w:t>
+      </w:r>
+    </w:p>
+    <w:p>
+      <w:pPr>
+        <w:pStyle w:val="Compact"/>
+        <w:numPr>
+          <w:ilvl w:val="0"/>
+          <w:numId w:val="1023"/>
+        </w:numPr>
+      </w:pPr>
+      <w:r>
+        <w:rPr>
+          <w:b/>
+          <w:bCs/>
+        </w:rPr>
+        <w:t xml:space="preserve">Vendre du Pro + sans capacité de livraison prioritaire prouvée.</w:t>
       </w:r>
       <w:r>
         <w:t xml:space="preserve"> </w:t>
@@ -5401,7 +5298,7 @@
         <w:pStyle w:val="Compact"/>
         <w:numPr>
           <w:ilvl w:val="0"/>
-          <w:numId w:val="1032"/>
+          <w:numId w:val="1023"/>
         </w:numPr>
       </w:pPr>
       <w:r>
@@ -5423,7 +5320,7 @@
         <w:pStyle w:val="Compact"/>
         <w:numPr>
           <w:ilvl w:val="0"/>
-          <w:numId w:val="1032"/>
+          <w:numId w:val="1023"/>
         </w:numPr>
       </w:pPr>
       <w:r>
@@ -5445,7 +5342,7 @@
         <w:pStyle w:val="Compact"/>
         <w:numPr>
           <w:ilvl w:val="0"/>
-          <w:numId w:val="1032"/>
+          <w:numId w:val="1023"/>
         </w:numPr>
       </w:pPr>
       <w:r>
@@ -5459,15 +5356,15 @@
         <w:t xml:space="preserve"> </w:t>
       </w:r>
       <w:r>
-        <w:t xml:space="preserve">C'est la mort lente de toute marketplace.</w:t>
-      </w:r>
-    </w:p>
-    <w:p>
-      <w:pPr>
-        <w:pStyle w:val="Compact"/>
-        <w:numPr>
-          <w:ilvl w:val="0"/>
-          <w:numId w:val="1032"/>
+        <w:t xml:space="preserve">C’est la mort lente de toute marketplace.</w:t>
+      </w:r>
+    </w:p>
+    <w:p>
+      <w:pPr>
+        <w:pStyle w:val="Compact"/>
+        <w:numPr>
+          <w:ilvl w:val="0"/>
+          <w:numId w:val="1023"/>
         </w:numPr>
       </w:pPr>
       <w:r>
@@ -5481,15 +5378,15 @@
         <w:t xml:space="preserve"> </w:t>
       </w:r>
       <w:r>
-        <w:t xml:space="preserve">L'expansion et la rétention sont le revenu le moins cher — les négliger, c'est laisser l'argent facile.</w:t>
-      </w:r>
-    </w:p>
-    <w:p>
-      <w:pPr>
-        <w:pStyle w:val="Compact"/>
-        <w:numPr>
-          <w:ilvl w:val="0"/>
-          <w:numId w:val="1032"/>
+        <w:t xml:space="preserve">L’expansion et la rétention sont le revenu le moins cher — les négliger, c’est laisser l’argent facile.</w:t>
+      </w:r>
+    </w:p>
+    <w:p>
+      <w:pPr>
+        <w:pStyle w:val="Compact"/>
+        <w:numPr>
+          <w:ilvl w:val="0"/>
+          <w:numId w:val="1023"/>
         </w:numPr>
       </w:pPr>
       <w:r>
@@ -5503,23 +5400,23 @@
         <w:t xml:space="preserve"> </w:t>
       </w:r>
       <w:r>
-        <w:t xml:space="preserve">C'est un cheval de Troie d'acquisition fiscale, pas un centre de profit immédiat.</w:t>
-      </w:r>
-    </w:p>
-    <w:p>
-      <w:pPr>
-        <w:pStyle w:val="Compact"/>
-        <w:numPr>
-          <w:ilvl w:val="0"/>
-          <w:numId w:val="1032"/>
-        </w:numPr>
-      </w:pPr>
-      <w:r>
-        <w:rPr>
-          <w:b/>
-          <w:bCs/>
-        </w:rPr>
-        <w:t xml:space="preserve">Empiler des pilotes gratuits sans date de fin ni mesure de conversion.</w:t>
+        <w:t xml:space="preserve">C’est un cheval de Troie d’acquisition fiscale, pas un centre de profit immédiat.</w:t>
+      </w:r>
+    </w:p>
+    <w:p>
+      <w:pPr>
+        <w:pStyle w:val="Compact"/>
+        <w:numPr>
+          <w:ilvl w:val="0"/>
+          <w:numId w:val="1023"/>
+        </w:numPr>
+      </w:pPr>
+      <w:r>
+        <w:rPr>
+          <w:b/>
+          <w:bCs/>
+        </w:rPr>
+        <w:t xml:space="preserve">Empiler des pilotes non tarifés sans date de fin ni mesure de conversion.</w:t>
       </w:r>
       <w:r>
         <w:t xml:space="preserve"> </w:t>
@@ -5533,7 +5430,7 @@
         <w:pStyle w:val="Compact"/>
         <w:numPr>
           <w:ilvl w:val="0"/>
-          <w:numId w:val="1032"/>
+          <w:numId w:val="1023"/>
         </w:numPr>
       </w:pPr>
       <w:r>
@@ -5547,7 +5444,7 @@
         <w:t xml:space="preserve"> </w:t>
       </w:r>
       <w:r>
-        <w:t xml:space="preserve">Optimiser la commission en cassant le récurrent (ou l'inverse) détruit la valeur. Le CRO arbitre les trois ensemble.</w:t>
+        <w:t xml:space="preserve">Optimiser la commission en cassant le récurrent (ou l’inverse) détruit la valeur. Le CRO arbitre les trois ensemble.</w:t>
       </w:r>
     </w:p>
     <w:p>
@@ -5557,8 +5454,8 @@
         </w:pict>
       </w:r>
     </w:p>
-    <w:bookmarkEnd w:id="57"/>
-    <w:bookmarkStart w:id="58" w:name="Xf22f2e81ae9c1c808a0e7e0eed315f02d4e26b2"/>
+    <w:bookmarkEnd w:id="68"/>
+    <w:bookmarkStart w:id="69" w:name="X8547c11d56a298ebeb4e128a812a74787b56b37"/>
     <w:p>
       <w:pPr>
         <w:pStyle w:val="Heading2"/>
@@ -5572,7 +5469,7 @@
         <w:pStyle w:val="FirstParagraph"/>
       </w:pPr>
       <w:r>
-        <w:t xml:space="preserve">Le CEO a raison sur le marché : il est gigantesque, fragmenté, mal servi, et la fenêtre est ouverte. Le CTO peut construire l'instrument. Mais</w:t>
+        <w:t xml:space="preserve">Le CEO a raison sur le marché : il est gigantesque, fragmenté, mal servi, et la fenêtre est ouverte. Le CTO peut construire l’instrument. Mais</w:t>
       </w:r>
       <w:r>
         <w:t xml:space="preserve"> </w:t>
@@ -5588,7 +5485,7 @@
         <w:t xml:space="preserve"> </w:t>
       </w:r>
       <w:r>
-        <w:t xml:space="preserve">— c'est la machine de revenu qui les transforme en valeur.</w:t>
+        <w:t xml:space="preserve">— c’est la machine de revenu qui les transforme en valeur.</w:t>
       </w:r>
     </w:p>
     <w:p>
@@ -5614,15 +5511,15 @@
       <w:r>
         <w:t xml:space="preserve">:</w:t>
       </w:r>
-    </w:p>
-    <w:p>
-      <w:pPr>
-        <w:pStyle w:val="Compact"/>
-        <w:numPr>
-          <w:ilvl w:val="0"/>
-          <w:numId w:val="1033"/>
-        </w:numPr>
-      </w:pPr>
+      <w:r>
+        <w:t xml:space="preserve"> </w:t>
+      </w:r>
+      <w:r>
+        <w:t xml:space="preserve">-</w:t>
+      </w:r>
+      <w:r>
+        <w:t xml:space="preserve"> </w:t>
+      </w:r>
       <w:r>
         <w:rPr>
           <w:b/>
@@ -5636,15 +5533,15 @@
       <w:r>
         <w:t xml:space="preserve">par la discipline du forecast, du pipeline et de la donnée.</w:t>
       </w:r>
-    </w:p>
-    <w:p>
-      <w:pPr>
-        <w:pStyle w:val="Compact"/>
-        <w:numPr>
-          <w:ilvl w:val="0"/>
-          <w:numId w:val="1033"/>
-        </w:numPr>
-      </w:pPr>
+      <w:r>
+        <w:t xml:space="preserve"> </w:t>
+      </w:r>
+      <w:r>
+        <w:t xml:space="preserve">-</w:t>
+      </w:r>
+      <w:r>
+        <w:t xml:space="preserve"> </w:t>
+      </w:r>
       <w:r>
         <w:rPr>
           <w:b/>
@@ -5656,17 +5553,17 @@
         <w:t xml:space="preserve"> </w:t>
       </w:r>
       <w:r>
-        <w:t xml:space="preserve">par l'acquisition rentable, l'expansion et la rétention nette.</w:t>
-      </w:r>
-    </w:p>
-    <w:p>
-      <w:pPr>
-        <w:pStyle w:val="Compact"/>
-        <w:numPr>
-          <w:ilvl w:val="0"/>
-          <w:numId w:val="1033"/>
-        </w:numPr>
-      </w:pPr>
+        <w:t xml:space="preserve">par l’acquisition rentable, l’expansion et la rétention nette.</w:t>
+      </w:r>
+      <w:r>
+        <w:t xml:space="preserve"> </w:t>
+      </w:r>
+      <w:r>
+        <w:t xml:space="preserve">-</w:t>
+      </w:r>
+      <w:r>
+        <w:t xml:space="preserve"> </w:t>
+      </w:r>
       <w:r>
         <w:rPr>
           <w:b/>
@@ -5683,7 +5580,7 @@
     </w:p>
     <w:p>
       <w:pPr>
-        <w:pStyle w:val="FirstParagraph"/>
+        <w:pStyle w:val="BodyText"/>
       </w:pPr>
       <w:r>
         <w:t xml:space="preserve">À 36 mois, le succès se lit sur trois nombres :</w:t>
@@ -5725,7 +5622,7 @@
         <w:t xml:space="preserve">NRR (&gt; 115%)</w:t>
       </w:r>
       <w:r>
-        <w:t xml:space="preserve">. Si ces trois sont verts, Pièces n'est pas une marketplace prometteuse — c'est une entreprise qui se valorise.</w:t>
+        <w:t xml:space="preserve">. Si ces trois sont verts, Pièces n’est pas une marketplace prometteuse — c’est une entreprise qui se valorise.</w:t>
       </w:r>
     </w:p>
     <w:p>
@@ -5845,7 +5742,7 @@
           <w:i/>
           <w:iCs/>
         </w:rPr>
-        <w:t xml:space="preserve">Pièces — la pièce qu'il te faut, au juste prix, livrée et garantie.</w:t>
+        <w:t xml:space="preserve">Pièces — la pièce qu’il te faut, au juste prix, livrée et garantie.</w:t>
       </w:r>
       <w:r>
         <w:t xml:space="preserve"> </w:t>
@@ -5858,13 +5755,9 @@
         <w:t xml:space="preserve">Document interne · Handover CRO · v1.0 · 28 mai 2026.</w:t>
       </w:r>
     </w:p>
-    <w:bookmarkEnd w:id="58"/>
-    <w:bookmarkEnd w:id="59"/>
-    <w:sectPr>
-      <w:footnotePr>
-        <w:numRestart w:val="eachSect"/>
-      </w:footnotePr>
-    </w:sectPr>
+    <w:bookmarkEnd w:id="69"/>
+    <w:bookmarkEnd w:id="70"/>
+    <w:sectPr/>
   </w:body>
 </w:document>
 </file>
@@ -6207,9 +6100,6 @@
     <w:abstractNumId w:val="991"/>
   </w:num>
   <w:num w:numId="1007">
-    <w:abstractNumId w:val="991"/>
-  </w:num>
-  <w:num w:numId="1008">
     <w:abstractNumId w:val="99411"/>
     <w:lvlOverride w:ilvl="0">
       <w:startOverride w:val="1"/>
@@ -6239,6 +6129,9 @@
       <w:startOverride w:val="1"/>
     </w:lvlOverride>
   </w:num>
+  <w:num w:numId="1008">
+    <w:abstractNumId w:val="991"/>
+  </w:num>
   <w:num w:numId="1009">
     <w:abstractNumId w:val="991"/>
   </w:num>
@@ -6246,34 +6139,7 @@
     <w:abstractNumId w:val="991"/>
   </w:num>
   <w:num w:numId="1011">
-    <w:abstractNumId w:val="99411"/>
-    <w:lvlOverride w:ilvl="0">
-      <w:startOverride w:val="1"/>
-    </w:lvlOverride>
-    <w:lvlOverride w:ilvl="1">
-      <w:startOverride w:val="1"/>
-    </w:lvlOverride>
-    <w:lvlOverride w:ilvl="2">
-      <w:startOverride w:val="1"/>
-    </w:lvlOverride>
-    <w:lvlOverride w:ilvl="3">
-      <w:startOverride w:val="1"/>
-    </w:lvlOverride>
-    <w:lvlOverride w:ilvl="4">
-      <w:startOverride w:val="1"/>
-    </w:lvlOverride>
-    <w:lvlOverride w:ilvl="5">
-      <w:startOverride w:val="1"/>
-    </w:lvlOverride>
-    <w:lvlOverride w:ilvl="6">
-      <w:startOverride w:val="1"/>
-    </w:lvlOverride>
-    <w:lvlOverride w:ilvl="7">
-      <w:startOverride w:val="1"/>
-    </w:lvlOverride>
-    <w:lvlOverride w:ilvl="8">
-      <w:startOverride w:val="1"/>
-    </w:lvlOverride>
+    <w:abstractNumId w:val="991"/>
   </w:num>
   <w:num w:numId="1012">
     <w:abstractNumId w:val="991"/>
@@ -6309,33 +6175,6 @@
     <w:abstractNumId w:val="991"/>
   </w:num>
   <w:num w:numId="1023">
-    <w:abstractNumId w:val="991"/>
-  </w:num>
-  <w:num w:numId="1024">
-    <w:abstractNumId w:val="991"/>
-  </w:num>
-  <w:num w:numId="1025">
-    <w:abstractNumId w:val="991"/>
-  </w:num>
-  <w:num w:numId="1026">
-    <w:abstractNumId w:val="991"/>
-  </w:num>
-  <w:num w:numId="1027">
-    <w:abstractNumId w:val="991"/>
-  </w:num>
-  <w:num w:numId="1028">
-    <w:abstractNumId w:val="991"/>
-  </w:num>
-  <w:num w:numId="1029">
-    <w:abstractNumId w:val="991"/>
-  </w:num>
-  <w:num w:numId="1030">
-    <w:abstractNumId w:val="991"/>
-  </w:num>
-  <w:num w:numId="1031">
-    <w:abstractNumId w:val="991"/>
-  </w:num>
-  <w:num w:numId="1032">
     <w:abstractNumId w:val="99411"/>
     <w:lvlOverride w:ilvl="0">
       <w:startOverride w:val="1"/>
@@ -6365,9 +6204,6 @@
       <w:startOverride w:val="1"/>
     </w:lvlOverride>
   </w:num>
-  <w:num w:numId="1033">
-    <w:abstractNumId w:val="991"/>
-  </w:num>
 </w:numbering>
 </file>
 
@@ -6376,10 +6212,10 @@
   <w:docDefaults>
     <w:rPrDefault>
       <w:rPr>
-        <w:rFonts w:asciiTheme="minorHAnsi" w:cstheme="minorBidi" w:eastAsiaTheme="minorEastAsia" w:hAnsiTheme="minorHAnsi"/>
+        <w:rFonts w:asciiTheme="minorHAnsi" w:cstheme="minorBidi" w:eastAsiaTheme="minorHAnsi" w:hAnsiTheme="minorHAnsi"/>
         <w:sz w:val="24"/>
         <w:szCs w:val="24"/>
-        <w:lang w:bidi="ar-SA" w:eastAsia="zh-CN" w:val="en-US"/>
+        <w:lang w:bidi="ar-SA" w:eastAsia="en-US" w:val="en-US"/>
       </w:rPr>
     </w:rPrDefault>
     <w:pPrDefault>
@@ -6431,6 +6267,8 @@
     </w:pPr>
     <w:rPr>
       <w:rFonts w:asciiTheme="majorHAnsi" w:cstheme="majorBidi" w:eastAsiaTheme="majorEastAsia" w:hAnsiTheme="majorHAnsi"/>
+      <w:spacing w:val="-10"/>
+      <w:kern w:val="28"/>
       <w:sz w:val="56"/>
       <w:szCs w:val="56"/>
     </w:rPr>
@@ -6443,6 +6281,8 @@
     <w:rsid w:val="00A10FD9"/>
     <w:rPr>
       <w:rFonts w:asciiTheme="majorHAnsi" w:cstheme="majorBidi" w:eastAsiaTheme="majorEastAsia" w:hAnsiTheme="majorHAnsi"/>
+      <w:spacing w:val="-10"/>
+      <w:kern w:val="28"/>
       <w:sz w:val="56"/>
       <w:szCs w:val="56"/>
     </w:rPr>
@@ -6483,31 +6323,23 @@
   </w:style>
   <w:style w:customStyle="1" w:styleId="Author" w:type="paragraph">
     <w:name w:val="Author"/>
-    <w:basedOn w:val="Title"/>
     <w:next w:val="BodyText"/>
     <w:qFormat/>
     <w:pPr>
       <w:keepNext/>
       <w:keepLines/>
+      <w:jc w:val="center"/>
     </w:pPr>
-    <w:rPr>
-      <w:sz w:val="24"/>
-      <w:szCs w:val="24"/>
-    </w:rPr>
   </w:style>
   <w:style w:styleId="Date" w:type="paragraph">
     <w:name w:val="Date"/>
-    <w:basedOn w:val="Title"/>
     <w:next w:val="BodyText"/>
     <w:qFormat/>
     <w:pPr>
       <w:keepNext/>
       <w:keepLines/>
+      <w:jc w:val="center"/>
     </w:pPr>
-    <w:rPr>
-      <w:sz w:val="24"/>
-      <w:szCs w:val="24"/>
-    </w:rPr>
   </w:style>
   <w:style w:customStyle="1" w:styleId="AbstractTitle" w:type="paragraph">
     <w:name w:val="Abstract Title"/>
@@ -6920,6 +6752,13 @@
       </w:tblCellMar>
     </w:tblPr>
     <w:tblStylePr w:type="firstRow">
+      <w:tblPr>
+        <w:jc w:val="left"/>
+        <w:tblInd w:type="dxa" w:w="0"/>
+      </w:tblPr>
+      <w:trPr>
+        <w:jc w:val="left"/>
+      </w:trPr>
       <w:tcPr>
         <w:tcBorders>
           <w:bottom w:val="single"/>

</xml_diff>